<commit_message>
cleaned hours temp files. feb finished
</commit_message>
<xml_diff>
--- a/docx_resources/Повечір`я/1-3 Велике Повечір`я з каноном Критського.docx
+++ b/docx_resources/Повечір`я/1-3 Велике Повечір`я з каноном Критського.docx
@@ -27,91 +27,58 @@
     <w:bookmarkEnd w:id="0"/>
     <w:p>
       <w:pPr>
-        <w:spacing w:line="276" w:lineRule="auto"/>
-        <w:jc w:val="both"/>
-        <w:rPr>
-          <w:rFonts w:ascii="Times New Roman" w:hAnsi="Times New Roman" w:cs="Times New Roman"/>
-          <w:sz w:val="24"/>
-          <w:szCs w:val="24"/>
-        </w:rPr>
-      </w:pPr>
-      <w:r>
-        <w:rPr>
-          <w:rFonts w:ascii="Times New Roman" w:hAnsi="Times New Roman" w:cs="Times New Roman"/>
-          <w:i/>
-          <w:iCs/>
-          <w:color w:val="FF0000"/>
-          <w:sz w:val="24"/>
-          <w:szCs w:val="24"/>
+        <w:spacing w:after="120"/>
+        <w:jc w:val="both"/>
+        <w:rPr>
+          <w:rFonts w:ascii="Times New Roman" w:hAnsi="Times New Roman"/>
+          <w:sz w:val="24"/>
+          <w:szCs w:val="24"/>
+        </w:rPr>
+      </w:pPr>
+      <w:r>
+        <w:rPr>
+          <w:rFonts w:ascii="Times New Roman" w:hAnsi="Times New Roman"/>
+          <w:i/>
+          <w:color w:val="FF0000"/>
+          <w:sz w:val="24"/>
         </w:rPr>
         <w:t>Священник:</w:t>
       </w:r>
       <w:r>
         <w:rPr>
-          <w:rFonts w:ascii="Times New Roman" w:hAnsi="Times New Roman" w:cs="Times New Roman"/>
-          <w:sz w:val="24"/>
-          <w:szCs w:val="24"/>
+          <w:rFonts w:ascii="Times New Roman" w:hAnsi="Times New Roman"/>
+          <w:sz w:val="24"/>
         </w:rPr>
         <w:t xml:space="preserve"> Благословенний Бог наш завжди, нині і повсякчас, і на віки віків.</w:t>
       </w:r>
     </w:p>
     <w:p>
       <w:pPr>
-        <w:spacing w:line="276" w:lineRule="auto"/>
-        <w:jc w:val="both"/>
-        <w:rPr>
-          <w:rFonts w:ascii="Times New Roman" w:hAnsi="Times New Roman" w:cs="Times New Roman"/>
-          <w:sz w:val="24"/>
-          <w:szCs w:val="24"/>
-        </w:rPr>
-      </w:pPr>
-      <w:r>
-        <w:rPr>
-          <w:rFonts w:ascii="Times New Roman" w:hAnsi="Times New Roman" w:cs="Times New Roman"/>
-          <w:i/>
-          <w:iCs/>
-          <w:color w:val="FF0000"/>
-          <w:sz w:val="24"/>
-          <w:szCs w:val="24"/>
-        </w:rPr>
-        <w:t>Хор:</w:t>
-      </w:r>
-      <w:r>
-        <w:rPr>
-          <w:rFonts w:ascii="Times New Roman" w:hAnsi="Times New Roman" w:cs="Times New Roman"/>
-          <w:i/>
-          <w:iCs/>
-          <w:sz w:val="24"/>
-          <w:szCs w:val="24"/>
+        <w:spacing w:after="120"/>
+      </w:pPr>
+      <w:r>
+        <w:rPr>
+          <w:rFonts w:ascii="Times New Roman" w:hAnsi="Times New Roman"/>
+          <w:i/>
+          <w:color w:val="FF0000"/>
+          <w:sz w:val="24"/>
+        </w:rPr>
+        <w:t>Вірні:</w:t>
+      </w:r>
+      <w:r>
+        <w:rPr>
+          <w:rFonts w:ascii="Times New Roman" w:hAnsi="Times New Roman"/>
+          <w:color w:val="FF0000"/>
+          <w:sz w:val="24"/>
         </w:rPr>
         <w:t xml:space="preserve"> </w:t>
       </w:r>
       <w:r>
         <w:rPr>
-          <w:rFonts w:ascii="Times New Roman" w:hAnsi="Times New Roman" w:cs="Times New Roman"/>
-          <w:sz w:val="24"/>
-          <w:szCs w:val="24"/>
-        </w:rPr>
-        <w:t>Амінь.</w:t>
-      </w:r>
-    </w:p>
-    <w:p>
-      <w:pPr>
-        <w:spacing w:line="276" w:lineRule="auto"/>
-        <w:jc w:val="both"/>
-        <w:rPr>
-          <w:rFonts w:ascii="Times New Roman" w:hAnsi="Times New Roman" w:cs="Times New Roman"/>
-          <w:sz w:val="24"/>
-          <w:szCs w:val="24"/>
-        </w:rPr>
-      </w:pPr>
-      <w:r>
-        <w:rPr>
-          <w:rFonts w:ascii="Times New Roman" w:hAnsi="Times New Roman" w:cs="Times New Roman"/>
-          <w:sz w:val="24"/>
-          <w:szCs w:val="24"/>
-        </w:rPr>
-        <w:t>Слава Тобі, Боже наш, слава Тобі.</w:t>
+          <w:rFonts w:ascii="Times New Roman" w:hAnsi="Times New Roman"/>
+          <w:sz w:val="24"/>
+        </w:rPr>
+        <w:t>Амі́нь.</w:t>
       </w:r>
     </w:p>
     <w:p>
@@ -123,24 +90,35 @@
           <w:rFonts w:ascii="Times New Roman" w:hAnsi="Times New Roman"/>
           <w:sz w:val="24"/>
         </w:rPr>
-        <w:t>Ца́рю небе́сний, утіши́телю, Ду́ше íстини, що всю́ди єси́ і все наповня́єш, скарбни́це благ і життя́ пода́телю, прийди́, і всели́ся в нас, і очи́сти нас від уся́кої скве́рни, і спаси́, благи́й, ду́ші на́ші.</w:t>
+        <w:t>Сла́ва Тобі́, Бо́же наш, сла́ва Тобі́.</w:t>
       </w:r>
     </w:p>
     <w:p>
       <w:pPr>
         <w:spacing w:after="120"/>
-        <w:jc w:val="both"/>
       </w:pPr>
       <w:r>
         <w:rPr>
           <w:rFonts w:ascii="Times New Roman" w:hAnsi="Times New Roman"/>
           <w:sz w:val="24"/>
         </w:rPr>
-        <w:t xml:space="preserve">Святий Боже, святий Кріпкий, святий Безсмертний, помилуй нас. </w:t>
-      </w:r>
+        <w:t>Ца́рю небе́сний, утіши́телю, Ду́ше íстини,* що всю́ди єси́ і все наповня́єш,* скарбни́це благ і життя́ пода́телю,* прийди́, і всели́ся в нас,* і очи́сти нас від уся́кої скве́рни,* і спаси́, благи́й, ду́ші на́ші.</w:t>
+      </w:r>
+    </w:p>
+    <w:p>
+      <w:pPr>
+        <w:spacing w:after="120"/>
+      </w:pPr>
       <w:r>
         <w:rPr>
           <w:rFonts w:ascii="Times New Roman" w:hAnsi="Times New Roman"/>
+          <w:sz w:val="24"/>
+        </w:rPr>
+        <w:t xml:space="preserve">Святи́й Бо́же, святи́й Крі́пкий, святи́й Безсме́ртний, поми́луй нас. </w:t>
+      </w:r>
+      <w:r>
+        <w:rPr>
+          <w:rFonts w:ascii="Times New Roman" w:hAnsi="Times New Roman"/>
           <w:i/>
           <w:color w:val="FF0000"/>
           <w:sz w:val="24"/>
@@ -150,57 +128,42 @@
     </w:p>
     <w:p>
       <w:pPr>
-        <w:spacing w:line="276" w:lineRule="auto"/>
-        <w:jc w:val="both"/>
-        <w:rPr>
-          <w:rFonts w:ascii="Times New Roman" w:hAnsi="Times New Roman" w:cs="Times New Roman"/>
-          <w:sz w:val="24"/>
-          <w:szCs w:val="24"/>
-        </w:rPr>
-      </w:pPr>
-      <w:r>
-        <w:rPr>
-          <w:rFonts w:ascii="Times New Roman" w:hAnsi="Times New Roman" w:cs="Times New Roman"/>
-          <w:sz w:val="24"/>
-          <w:szCs w:val="24"/>
-        </w:rPr>
-        <w:t>Слава Отцю, і Сину, і Святому Духові, і нині, і повсякчас, і на віки віків. Амінь.</w:t>
-      </w:r>
-    </w:p>
-    <w:p>
-      <w:pPr>
-        <w:spacing w:line="276" w:lineRule="auto"/>
-        <w:jc w:val="both"/>
-        <w:rPr>
-          <w:rFonts w:ascii="Times New Roman" w:hAnsi="Times New Roman" w:cs="Times New Roman"/>
-          <w:sz w:val="24"/>
-          <w:szCs w:val="24"/>
-        </w:rPr>
-      </w:pPr>
-      <w:r>
-        <w:rPr>
-          <w:rFonts w:ascii="Times New Roman" w:hAnsi="Times New Roman" w:cs="Times New Roman"/>
-          <w:sz w:val="24"/>
-          <w:szCs w:val="24"/>
-        </w:rPr>
-        <w:t>Пресвята Тройце, помилуй нас; Господи, очисти гріхи наші; Владико, прости беззаконня наші; Святий, посіти і зціли немочі наші імени твого ради.</w:t>
-      </w:r>
-    </w:p>
-    <w:p>
-      <w:pPr>
         <w:spacing w:after="120"/>
-        <w:jc w:val="both"/>
       </w:pPr>
       <w:r>
         <w:rPr>
           <w:rFonts w:ascii="Times New Roman" w:hAnsi="Times New Roman"/>
           <w:sz w:val="24"/>
         </w:rPr>
-        <w:t xml:space="preserve">Господи, помилуй. </w:t>
-      </w:r>
+        <w:t>Сла́ва Отцю́, і Си́ну, і Свято́му Ду́хові,* і ни́ні, і повсякча́с, і на ві́ки вікі́в. Амі́нь.</w:t>
+      </w:r>
+    </w:p>
+    <w:p>
+      <w:pPr>
+        <w:spacing w:after="120"/>
+      </w:pPr>
       <w:r>
         <w:rPr>
           <w:rFonts w:ascii="Times New Roman" w:hAnsi="Times New Roman"/>
+          <w:sz w:val="24"/>
+        </w:rPr>
+        <w:t>Пресвята́ Тро́йце, поми́луй нас; Го́споди, очи́сти гріхи́ на́ші; Влади́ко, прости́ беззако́ння на́ші; Святи́й, завіта́й і зціли́ не́мочі на́ші, І́мени Твого́ ра́ди.</w:t>
+      </w:r>
+    </w:p>
+    <w:p>
+      <w:pPr>
+        <w:spacing w:after="120"/>
+      </w:pPr>
+      <w:r>
+        <w:rPr>
+          <w:rFonts w:ascii="Times New Roman" w:hAnsi="Times New Roman"/>
+          <w:sz w:val="24"/>
+        </w:rPr>
+        <w:t xml:space="preserve">Го́споди, поми́луй. </w:t>
+      </w:r>
+      <w:r>
+        <w:rPr>
+          <w:rFonts w:ascii="Times New Roman" w:hAnsi="Times New Roman"/>
           <w:i/>
           <w:color w:val="FF0000"/>
           <w:sz w:val="24"/>
@@ -210,50 +173,37 @@
     </w:p>
     <w:p>
       <w:pPr>
-        <w:spacing w:line="276" w:lineRule="auto"/>
-        <w:jc w:val="both"/>
-        <w:rPr>
-          <w:rFonts w:ascii="Times New Roman" w:hAnsi="Times New Roman" w:cs="Times New Roman"/>
-          <w:sz w:val="24"/>
-          <w:szCs w:val="24"/>
-        </w:rPr>
-      </w:pPr>
-      <w:r>
-        <w:rPr>
-          <w:rFonts w:ascii="Times New Roman" w:hAnsi="Times New Roman" w:cs="Times New Roman"/>
-          <w:sz w:val="24"/>
-          <w:szCs w:val="24"/>
-        </w:rPr>
-        <w:t>Слава Отцю, і Сину, і Святому Духові, і нині, і повсякчас, і на віки віків. Амінь.</w:t>
-      </w:r>
-    </w:p>
-    <w:p>
-      <w:pPr>
-        <w:spacing w:line="276" w:lineRule="auto"/>
-        <w:jc w:val="both"/>
-        <w:rPr>
-          <w:rFonts w:ascii="Times New Roman" w:hAnsi="Times New Roman" w:cs="Times New Roman"/>
-          <w:sz w:val="24"/>
-          <w:szCs w:val="24"/>
-        </w:rPr>
-      </w:pPr>
-      <w:r>
-        <w:rPr>
-          <w:rFonts w:ascii="Times New Roman" w:hAnsi="Times New Roman" w:cs="Times New Roman"/>
-          <w:sz w:val="24"/>
-          <w:szCs w:val="24"/>
-        </w:rPr>
-        <w:t>Отче наш, що єси на небесах, нехай святиться ім’я Твоє, нехай прийде царство Твоє, нехай буде воля твоя, як на небі, так і на землі. Хліб наш насущний дай нам сьогодні; і прости нам провини наші, як і ми прощаємо винуватцям нашим; і не введи нас у спокусу, але визволи нас від лукавого.</w:t>
-      </w:r>
-    </w:p>
-    <w:p>
-      <w:pPr>
         <w:spacing w:after="120"/>
-        <w:jc w:val="both"/>
       </w:pPr>
       <w:r>
         <w:rPr>
           <w:rFonts w:ascii="Times New Roman" w:hAnsi="Times New Roman"/>
+          <w:sz w:val="24"/>
+        </w:rPr>
+        <w:t>Сла́ва Отцю́, і Си́ну, і Свято́му Ду́хові,* і ни́ні, і повсякча́с, і на ві́ки вікі́в. Амі́нь.</w:t>
+      </w:r>
+    </w:p>
+    <w:p>
+      <w:pPr>
+        <w:spacing w:after="120"/>
+        <w:jc w:val="both"/>
+      </w:pPr>
+      <w:r>
+        <w:rPr>
+          <w:rFonts w:ascii="Times New Roman" w:hAnsi="Times New Roman"/>
+          <w:sz w:val="24"/>
+        </w:rPr>
+        <w:t>О́тче наш, що єси́ на небеса́х,* неха́й святи́ться ім’я́ Твоє́,* неха́й при́йде ца́рство Твоє́,* неха́й бу́де во́ля Твоя́, як на не́бі, так і на землі́.* Хліб наш насу́щний дай нам сього́дні;* і прости́ нам прови́ни на́ші,* як і ми проща́ємо винува́тцям на́шим;* і не введи́ нас у споку́су,* але́ ви́зволи нас від лука́вого.</w:t>
+      </w:r>
+    </w:p>
+    <w:p>
+      <w:pPr>
+        <w:spacing w:after="120"/>
+        <w:jc w:val="both"/>
+      </w:pPr>
+      <w:r>
+        <w:rPr>
+          <w:rFonts w:ascii="Times New Roman" w:hAnsi="Times New Roman"/>
           <w:i/>
           <w:color w:val="FF0000"/>
           <w:sz w:val="24"/>
@@ -270,146 +220,93 @@
     </w:p>
     <w:p>
       <w:pPr>
-        <w:spacing w:line="276" w:lineRule="auto"/>
-        <w:jc w:val="both"/>
-        <w:rPr>
-          <w:rFonts w:ascii="Times New Roman" w:hAnsi="Times New Roman" w:cs="Times New Roman"/>
-          <w:sz w:val="24"/>
-          <w:szCs w:val="24"/>
-        </w:rPr>
-      </w:pPr>
-      <w:r>
-        <w:rPr>
-          <w:rFonts w:ascii="Times New Roman" w:hAnsi="Times New Roman" w:cs="Times New Roman"/>
-          <w:i/>
-          <w:iCs/>
-          <w:color w:val="FF0000"/>
-          <w:sz w:val="24"/>
-          <w:szCs w:val="24"/>
-        </w:rPr>
-        <w:t>Хор:</w:t>
-      </w:r>
-      <w:r>
-        <w:rPr>
-          <w:rFonts w:ascii="Times New Roman" w:hAnsi="Times New Roman" w:cs="Times New Roman"/>
-          <w:sz w:val="24"/>
-          <w:szCs w:val="24"/>
-        </w:rPr>
-        <w:t xml:space="preserve"> Амінь.</w:t>
-      </w:r>
-    </w:p>
-    <w:p>
-      <w:pPr>
-        <w:spacing w:line="276" w:lineRule="auto"/>
-        <w:jc w:val="both"/>
-        <w:rPr>
-          <w:rFonts w:ascii="Times New Roman" w:hAnsi="Times New Roman" w:cs="Times New Roman"/>
-          <w:sz w:val="24"/>
-          <w:szCs w:val="24"/>
-        </w:rPr>
-      </w:pPr>
-      <w:r>
-        <w:rPr>
-          <w:rFonts w:ascii="Times New Roman" w:hAnsi="Times New Roman" w:cs="Times New Roman"/>
-          <w:sz w:val="24"/>
-          <w:szCs w:val="24"/>
-        </w:rPr>
-        <w:t xml:space="preserve">Господи, помилуй </w:t>
-      </w:r>
-      <w:r>
-        <w:rPr>
-          <w:rFonts w:ascii="Times New Roman" w:hAnsi="Times New Roman" w:cs="Times New Roman"/>
-          <w:i/>
-          <w:iCs/>
-          <w:color w:val="FF0000"/>
-          <w:sz w:val="24"/>
-          <w:szCs w:val="24"/>
+        <w:spacing w:after="120"/>
+        <w:jc w:val="both"/>
+      </w:pPr>
+      <w:r>
+        <w:rPr>
+          <w:rFonts w:ascii="Times New Roman" w:hAnsi="Times New Roman"/>
+          <w:i/>
+          <w:color w:val="FF0000"/>
+          <w:sz w:val="24"/>
+        </w:rPr>
+        <w:t>Вірні:</w:t>
+      </w:r>
+      <w:r>
+        <w:rPr>
+          <w:rFonts w:ascii="Times New Roman" w:hAnsi="Times New Roman"/>
+          <w:color w:val="FF0000"/>
+          <w:sz w:val="24"/>
+        </w:rPr>
+        <w:t xml:space="preserve"> </w:t>
+      </w:r>
+      <w:r>
+        <w:rPr>
+          <w:rFonts w:ascii="Times New Roman" w:hAnsi="Times New Roman"/>
+          <w:sz w:val="24"/>
+        </w:rPr>
+        <w:t xml:space="preserve">Амі́нь. Го́споди, поми́луй. </w:t>
+      </w:r>
+      <w:r>
+        <w:rPr>
+          <w:rFonts w:ascii="Times New Roman" w:hAnsi="Times New Roman"/>
+          <w:i/>
+          <w:color w:val="FF0000"/>
+          <w:sz w:val="24"/>
         </w:rPr>
         <w:t>(12 р.)</w:t>
       </w:r>
-      <w:r>
-        <w:rPr>
-          <w:rFonts w:ascii="Times New Roman" w:hAnsi="Times New Roman" w:cs="Times New Roman"/>
-          <w:sz w:val="24"/>
-          <w:szCs w:val="24"/>
-        </w:rPr>
-        <w:t>.</w:t>
-      </w:r>
-    </w:p>
-    <w:p>
-      <w:pPr>
-        <w:spacing w:line="276" w:lineRule="auto"/>
-        <w:jc w:val="both"/>
-        <w:rPr>
-          <w:rFonts w:ascii="Times New Roman" w:hAnsi="Times New Roman" w:cs="Times New Roman"/>
-          <w:sz w:val="24"/>
-          <w:szCs w:val="24"/>
-        </w:rPr>
-      </w:pPr>
-      <w:r>
-        <w:rPr>
-          <w:rFonts w:ascii="Times New Roman" w:hAnsi="Times New Roman" w:cs="Times New Roman"/>
-          <w:sz w:val="24"/>
-          <w:szCs w:val="24"/>
-        </w:rPr>
-        <w:t>Слава Отцю, і Сину, і Святому Духові, і нині, і повсякчас, і на віки віків. Амінь.</w:t>
-      </w:r>
-    </w:p>
-    <w:p>
-      <w:pPr>
-        <w:spacing w:line="276" w:lineRule="auto"/>
-        <w:jc w:val="both"/>
-        <w:rPr>
-          <w:rFonts w:ascii="Times New Roman" w:hAnsi="Times New Roman" w:cs="Times New Roman"/>
-          <w:sz w:val="24"/>
-          <w:szCs w:val="24"/>
-        </w:rPr>
-      </w:pPr>
-      <w:r>
-        <w:rPr>
-          <w:rFonts w:ascii="Times New Roman" w:hAnsi="Times New Roman" w:cs="Times New Roman"/>
-          <w:sz w:val="24"/>
-          <w:szCs w:val="24"/>
-        </w:rPr>
-        <w:t>Прийдіте, поклонімся цареві нашому, Богу.</w:t>
-      </w:r>
-    </w:p>
-    <w:p>
-      <w:pPr>
-        <w:spacing w:line="276" w:lineRule="auto"/>
-        <w:jc w:val="both"/>
-        <w:rPr>
-          <w:rFonts w:ascii="Times New Roman" w:hAnsi="Times New Roman" w:cs="Times New Roman"/>
-          <w:sz w:val="24"/>
-          <w:szCs w:val="24"/>
-        </w:rPr>
-      </w:pPr>
-      <w:r>
-        <w:rPr>
-          <w:rFonts w:ascii="Times New Roman" w:hAnsi="Times New Roman" w:cs="Times New Roman"/>
-          <w:sz w:val="24"/>
-          <w:szCs w:val="24"/>
-        </w:rPr>
-        <w:t>Прийдіте, поклонімся Христові, цареві нашому Богу.</w:t>
-      </w:r>
-    </w:p>
-    <w:p>
-      <w:pPr>
-        <w:spacing w:line="276" w:lineRule="auto"/>
-        <w:jc w:val="both"/>
-        <w:rPr>
-          <w:rFonts w:ascii="Times New Roman" w:hAnsi="Times New Roman" w:cs="Times New Roman"/>
-          <w:sz w:val="24"/>
-          <w:szCs w:val="24"/>
-        </w:rPr>
-      </w:pPr>
-      <w:r>
-        <w:rPr>
-          <w:rFonts w:ascii="Times New Roman" w:hAnsi="Times New Roman" w:cs="Times New Roman"/>
-          <w:sz w:val="24"/>
-          <w:szCs w:val="24"/>
-        </w:rPr>
-        <w:t>Прийдіте, поклонімся і припадім до самого Господа Ісуса Христа, царя і Бога нашого.</w:t>
+    </w:p>
+    <w:p>
+      <w:pPr>
+        <w:spacing w:after="120"/>
+        <w:jc w:val="both"/>
+      </w:pPr>
+      <w:r>
+        <w:rPr>
+          <w:rFonts w:ascii="Times New Roman" w:hAnsi="Times New Roman"/>
+          <w:sz w:val="24"/>
+        </w:rPr>
+        <w:t>Сла́ва Отцю́, і Си́ну, і Свято́му Ду́хові,* і ни́ні, і повсякча́с, і на ві́ки вікі́в. Амі́нь.</w:t>
+      </w:r>
+    </w:p>
+    <w:p>
+      <w:pPr>
+        <w:spacing w:after="120"/>
+      </w:pPr>
+      <w:r>
+        <w:rPr>
+          <w:rFonts w:ascii="Times New Roman" w:eastAsia="Times New Roman" w:hAnsi="Times New Roman" w:cs="Times New Roman"/>
+          <w:sz w:val="24"/>
+          <w:szCs w:val="24"/>
+        </w:rPr>
+        <w:t>Прийді́те, поклоні́мся* царе́ві на́шому – Бо́гу.</w:t>
+      </w:r>
+    </w:p>
+    <w:p>
+      <w:pPr>
+        <w:spacing w:after="120"/>
+      </w:pPr>
+      <w:r>
+        <w:rPr>
+          <w:rFonts w:ascii="Times New Roman" w:eastAsia="Times New Roman" w:hAnsi="Times New Roman" w:cs="Times New Roman"/>
+          <w:sz w:val="24"/>
+          <w:szCs w:val="24"/>
+        </w:rPr>
+        <w:t>Прийді́те, поклоні́мся* Христо́ві, царе́ві на́шому – Бо́гу.</w:t>
+      </w:r>
+    </w:p>
+    <w:p>
+      <w:pPr>
+        <w:spacing w:after="120"/>
+      </w:pPr>
+      <w:r>
+        <w:rPr>
+          <w:rFonts w:ascii="Times New Roman" w:eastAsia="Times New Roman" w:hAnsi="Times New Roman" w:cs="Times New Roman"/>
+          <w:sz w:val="24"/>
+          <w:szCs w:val="24"/>
+        </w:rPr>
+        <w:t>Прийді́те, поклоні́мся і припаді́м* до само́го Го́спода Ісу́са Христа́ – царя́ і Бо́га на́шого.</w:t>
       </w:r>
     </w:p>
     <w:p>
@@ -645,6 +542,7 @@
           <w:iCs/>
           <w:color w:val="FF0000"/>
         </w:rPr>
+        <w:lastRenderedPageBreak/>
         <w:t>Ірмос (г. 6):</w:t>
       </w:r>
       <w:r>
@@ -1007,34 +905,34 @@
         <w:rPr>
           <w:rStyle w:val="Strong"/>
         </w:rPr>
+        <w:t xml:space="preserve">Слава, </w:t>
+      </w:r>
+      <w:r>
+        <w:rPr>
+          <w:rStyle w:val="Emphasis"/>
+          <w:color w:val="FF0000"/>
+        </w:rPr>
+        <w:t>Троїчний:</w:t>
+      </w:r>
+    </w:p>
+    <w:p>
+      <w:pPr>
+        <w:pStyle w:val="cdt4ke"/>
+        <w:spacing w:before="225" w:beforeAutospacing="0" w:after="0" w:afterAutospacing="0" w:line="276" w:lineRule="auto"/>
+        <w:textAlignment w:val="top"/>
+      </w:pPr>
+      <w:r>
+        <w:t>Понад усяке буття, Тройце, Тобі поклоняємось як єдиному Богу,</w:t>
+      </w:r>
+    </w:p>
+    <w:p>
+      <w:pPr>
+        <w:pStyle w:val="cdt4ke"/>
+        <w:spacing w:before="225" w:beforeAutospacing="0" w:after="0" w:afterAutospacing="0" w:line="276" w:lineRule="auto"/>
+        <w:textAlignment w:val="top"/>
+      </w:pPr>
+      <w:r>
         <w:lastRenderedPageBreak/>
-        <w:t xml:space="preserve">Слава, </w:t>
-      </w:r>
-      <w:r>
-        <w:rPr>
-          <w:rStyle w:val="Emphasis"/>
-          <w:color w:val="FF0000"/>
-        </w:rPr>
-        <w:t>Троїчний:</w:t>
-      </w:r>
-    </w:p>
-    <w:p>
-      <w:pPr>
-        <w:pStyle w:val="cdt4ke"/>
-        <w:spacing w:before="225" w:beforeAutospacing="0" w:after="0" w:afterAutospacing="0" w:line="276" w:lineRule="auto"/>
-        <w:textAlignment w:val="top"/>
-      </w:pPr>
-      <w:r>
-        <w:t>Понад усяке буття, Тройце, Тобі поклоняємось як єдиному Богу,</w:t>
-      </w:r>
-    </w:p>
-    <w:p>
-      <w:pPr>
-        <w:pStyle w:val="cdt4ke"/>
-        <w:spacing w:before="225" w:beforeAutospacing="0" w:after="0" w:afterAutospacing="0" w:line="276" w:lineRule="auto"/>
-        <w:textAlignment w:val="top"/>
-      </w:pPr>
-      <w:r>
         <w:t>зніми з мене тягар гріхів моїх і як милосердна подай мені сльози зворушення.</w:t>
       </w:r>
     </w:p>
@@ -1466,7 +1364,6 @@
         <w:textAlignment w:val="top"/>
       </w:pPr>
       <w:r>
-        <w:lastRenderedPageBreak/>
         <w:t>7. Піклуючись ревно про зовнішні прикраси,</w:t>
       </w:r>
     </w:p>
@@ -1496,6 +1393,7 @@
           <w:iCs/>
           <w:color w:val="FF0000"/>
         </w:rPr>
+        <w:lastRenderedPageBreak/>
         <w:t xml:space="preserve">Приспів: </w:t>
       </w:r>
       <w:r>
@@ -1897,27 +1795,27 @@
         <w:textAlignment w:val="top"/>
       </w:pPr>
       <w:r>
+        <w:t>2. Згрішив я, Господи, перед Тобою, згрішив я — очисти мене.</w:t>
+      </w:r>
+    </w:p>
+    <w:p>
+      <w:pPr>
+        <w:pStyle w:val="cdt4ke"/>
+        <w:spacing w:before="225" w:beforeAutospacing="0" w:after="0" w:afterAutospacing="0" w:line="276" w:lineRule="auto"/>
+        <w:textAlignment w:val="top"/>
+      </w:pPr>
+      <w:r>
+        <w:t>Нема ж бо такого серед людей,</w:t>
+      </w:r>
+    </w:p>
+    <w:p>
+      <w:pPr>
+        <w:pStyle w:val="cdt4ke"/>
+        <w:spacing w:before="225" w:beforeAutospacing="0" w:after="0" w:afterAutospacing="0" w:line="276" w:lineRule="auto"/>
+        <w:textAlignment w:val="top"/>
+      </w:pPr>
+      <w:r>
         <w:lastRenderedPageBreak/>
-        <w:t>2. Згрішив я, Господи, перед Тобою, згрішив я — очисти мене.</w:t>
-      </w:r>
-    </w:p>
-    <w:p>
-      <w:pPr>
-        <w:pStyle w:val="cdt4ke"/>
-        <w:spacing w:before="225" w:beforeAutospacing="0" w:after="0" w:afterAutospacing="0" w:line="276" w:lineRule="auto"/>
-        <w:textAlignment w:val="top"/>
-      </w:pPr>
-      <w:r>
-        <w:t>Нема ж бо такого серед людей,</w:t>
-      </w:r>
-    </w:p>
-    <w:p>
-      <w:pPr>
-        <w:pStyle w:val="cdt4ke"/>
-        <w:spacing w:before="225" w:beforeAutospacing="0" w:after="0" w:afterAutospacing="0" w:line="276" w:lineRule="auto"/>
-        <w:textAlignment w:val="top"/>
-      </w:pPr>
-      <w:r>
         <w:t>кого б я не перевершив гріхами.</w:t>
       </w:r>
     </w:p>
@@ -2325,6 +2223,7 @@
         <w:textAlignment w:val="top"/>
       </w:pPr>
       <w:r>
+        <w:lastRenderedPageBreak/>
         <w:t>Про страшний день пришестя Твого</w:t>
       </w:r>
     </w:p>
@@ -2665,7 +2564,6 @@
         <w:textAlignment w:val="top"/>
       </w:pPr>
       <w:r>
-        <w:lastRenderedPageBreak/>
         <w:t>бо завжди палав нестриманістю й осквернявся похіттю, то й звався Едом,</w:t>
       </w:r>
     </w:p>
@@ -2712,6 +2610,7 @@
         <w:textAlignment w:val="top"/>
       </w:pPr>
       <w:r>
+        <w:lastRenderedPageBreak/>
         <w:t>5. Знаючи про Йова, що сидів на гноїщі й</w:t>
       </w:r>
     </w:p>
@@ -3055,7 +2954,6 @@
           <w:iCs/>
           <w:color w:val="FF0000"/>
         </w:rPr>
-        <w:lastRenderedPageBreak/>
         <w:t xml:space="preserve">Приспів: </w:t>
       </w:r>
       <w:r>
@@ -3094,6 +2992,7 @@
         <w:textAlignment w:val="top"/>
       </w:pPr>
       <w:r>
+        <w:lastRenderedPageBreak/>
         <w:t>Тож нині, як великий Мойсей, годуйся премудрістю.</w:t>
       </w:r>
     </w:p>
@@ -3436,7 +3335,6 @@
         <w:textAlignment w:val="top"/>
       </w:pPr>
       <w:r>
-        <w:lastRenderedPageBreak/>
         <w:t>що сотворив віки,</w:t>
       </w:r>
     </w:p>
@@ -3478,6 +3376,7 @@
           <w:iCs/>
           <w:szCs w:val="24"/>
         </w:rPr>
+        <w:lastRenderedPageBreak/>
         <w:t>Пісня 6</w:t>
       </w:r>
     </w:p>
@@ -3849,28 +3748,28 @@
         <w:textAlignment w:val="top"/>
       </w:pPr>
       <w:r>
+        <w:t>про це свідчить Отець, Син і Дух Божественний.</w:t>
+      </w:r>
+    </w:p>
+    <w:p>
+      <w:pPr>
+        <w:pStyle w:val="cdt4ke"/>
+        <w:spacing w:before="225" w:beforeAutospacing="0" w:after="0" w:afterAutospacing="0" w:line="276" w:lineRule="auto"/>
+        <w:textAlignment w:val="top"/>
+      </w:pPr>
+    </w:p>
+    <w:p>
+      <w:pPr>
+        <w:pStyle w:val="cdt4ke"/>
+        <w:spacing w:before="225" w:beforeAutospacing="0" w:after="0" w:afterAutospacing="0" w:line="276" w:lineRule="auto"/>
+        <w:jc w:val="center"/>
+        <w:textAlignment w:val="top"/>
+      </w:pPr>
+      <w:r>
+        <w:rPr>
+          <w:rStyle w:val="Strong"/>
+        </w:rPr>
         <w:lastRenderedPageBreak/>
-        <w:t>про це свідчить Отець, Син і Дух Божественний.</w:t>
-      </w:r>
-    </w:p>
-    <w:p>
-      <w:pPr>
-        <w:pStyle w:val="cdt4ke"/>
-        <w:spacing w:before="225" w:beforeAutospacing="0" w:after="0" w:afterAutospacing="0" w:line="276" w:lineRule="auto"/>
-        <w:textAlignment w:val="top"/>
-      </w:pPr>
-    </w:p>
-    <w:p>
-      <w:pPr>
-        <w:pStyle w:val="cdt4ke"/>
-        <w:spacing w:before="225" w:beforeAutospacing="0" w:after="0" w:afterAutospacing="0" w:line="276" w:lineRule="auto"/>
-        <w:jc w:val="center"/>
-        <w:textAlignment w:val="top"/>
-      </w:pPr>
-      <w:r>
-        <w:rPr>
-          <w:rStyle w:val="Strong"/>
-        </w:rPr>
         <w:t xml:space="preserve">І нині, </w:t>
       </w:r>
       <w:r>
@@ -4312,7 +4211,6 @@
         <w:textAlignment w:val="top"/>
       </w:pPr>
       <w:r>
-        <w:lastRenderedPageBreak/>
         <w:t>учинив колись зло і відступив від Бога,</w:t>
       </w:r>
     </w:p>
@@ -4342,6 +4240,7 @@
           <w:iCs/>
           <w:color w:val="FF0000"/>
         </w:rPr>
+        <w:lastRenderedPageBreak/>
         <w:t xml:space="preserve">Приспів: </w:t>
       </w:r>
       <w:r>
@@ -4715,29 +4614,29 @@
         <w:textAlignment w:val="top"/>
       </w:pPr>
       <w:r>
+        <w:t>1. Наслідуючи Озію, ти подвійно вражена його проказою,</w:t>
+      </w:r>
+    </w:p>
+    <w:p>
+      <w:pPr>
+        <w:pStyle w:val="cdt4ke"/>
+        <w:spacing w:before="225" w:beforeAutospacing="0" w:after="0" w:afterAutospacing="0" w:line="276" w:lineRule="auto"/>
+        <w:jc w:val="both"/>
+        <w:textAlignment w:val="top"/>
+      </w:pPr>
+      <w:r>
+        <w:t>бо думаєш негідне і твориш беззаконня.</w:t>
+      </w:r>
+    </w:p>
+    <w:p>
+      <w:pPr>
+        <w:pStyle w:val="cdt4ke"/>
+        <w:spacing w:before="225" w:beforeAutospacing="0" w:after="0" w:afterAutospacing="0" w:line="276" w:lineRule="auto"/>
+        <w:jc w:val="both"/>
+        <w:textAlignment w:val="top"/>
+      </w:pPr>
+      <w:r>
         <w:lastRenderedPageBreak/>
-        <w:t>1. Наслідуючи Озію, ти подвійно вражена його проказою,</w:t>
-      </w:r>
-    </w:p>
-    <w:p>
-      <w:pPr>
-        <w:pStyle w:val="cdt4ke"/>
-        <w:spacing w:before="225" w:beforeAutospacing="0" w:after="0" w:afterAutospacing="0" w:line="276" w:lineRule="auto"/>
-        <w:jc w:val="both"/>
-        <w:textAlignment w:val="top"/>
-      </w:pPr>
-      <w:r>
-        <w:t>бо думаєш негідне і твориш беззаконня.</w:t>
-      </w:r>
-    </w:p>
-    <w:p>
-      <w:pPr>
-        <w:pStyle w:val="cdt4ke"/>
-        <w:spacing w:before="225" w:beforeAutospacing="0" w:after="0" w:afterAutospacing="0" w:line="276" w:lineRule="auto"/>
-        <w:jc w:val="both"/>
-        <w:textAlignment w:val="top"/>
-      </w:pPr>
-      <w:r>
         <w:t>Покинь, душе, до чого прив’язана, й поспішай до покаяння.</w:t>
       </w:r>
     </w:p>
@@ -5104,31 +5003,31 @@
         <w:textAlignment w:val="top"/>
       </w:pPr>
       <w:r>
+        <w:t>живий і всетворячий Душе – Єдина Тройце –</w:t>
+      </w:r>
+    </w:p>
+    <w:p>
+      <w:pPr>
+        <w:pStyle w:val="cdt4ke"/>
+        <w:spacing w:before="225" w:beforeAutospacing="0" w:after="0" w:afterAutospacing="0" w:line="276" w:lineRule="auto"/>
+        <w:textAlignment w:val="top"/>
+      </w:pPr>
+      <w:r>
+        <w:t>помилуй мене.</w:t>
+      </w:r>
+    </w:p>
+    <w:p>
+      <w:pPr>
+        <w:pStyle w:val="cdt4ke"/>
+        <w:spacing w:before="225" w:beforeAutospacing="0" w:after="0" w:afterAutospacing="0" w:line="276" w:lineRule="auto"/>
+        <w:jc w:val="center"/>
+        <w:textAlignment w:val="top"/>
+      </w:pPr>
+      <w:r>
+        <w:rPr>
+          <w:rStyle w:val="Strong"/>
+        </w:rPr>
         <w:lastRenderedPageBreak/>
-        <w:t>живий і всетворячий Душе – Єдина Тройце –</w:t>
-      </w:r>
-    </w:p>
-    <w:p>
-      <w:pPr>
-        <w:pStyle w:val="cdt4ke"/>
-        <w:spacing w:before="225" w:beforeAutospacing="0" w:after="0" w:afterAutospacing="0" w:line="276" w:lineRule="auto"/>
-        <w:textAlignment w:val="top"/>
-      </w:pPr>
-      <w:r>
-        <w:t>помилуй мене.</w:t>
-      </w:r>
-    </w:p>
-    <w:p>
-      <w:pPr>
-        <w:pStyle w:val="cdt4ke"/>
-        <w:spacing w:before="225" w:beforeAutospacing="0" w:after="0" w:afterAutospacing="0" w:line="276" w:lineRule="auto"/>
-        <w:jc w:val="center"/>
-        <w:textAlignment w:val="top"/>
-      </w:pPr>
-      <w:r>
-        <w:rPr>
-          <w:rStyle w:val="Strong"/>
-        </w:rPr>
         <w:t xml:space="preserve">І нині, </w:t>
       </w:r>
       <w:r>
@@ -5499,29 +5398,29 @@
         <w:textAlignment w:val="top"/>
       </w:pPr>
       <w:r>
+        <w:t>бо спочатку благословив їх Христос.</w:t>
+      </w:r>
+    </w:p>
+    <w:p>
+      <w:pPr>
+        <w:pStyle w:val="cdt4ke"/>
+        <w:spacing w:before="225" w:beforeAutospacing="0" w:after="0" w:afterAutospacing="0" w:line="276" w:lineRule="auto"/>
+        <w:jc w:val="both"/>
+        <w:textAlignment w:val="top"/>
+      </w:pPr>
+      <w:r>
+        <w:t>На весіллі у Кані Галилейській як людина Він їв і перетворив воду на вино,</w:t>
+      </w:r>
+    </w:p>
+    <w:p>
+      <w:pPr>
+        <w:pStyle w:val="cdt4ke"/>
+        <w:spacing w:before="225" w:beforeAutospacing="0" w:after="0" w:afterAutospacing="0" w:line="276" w:lineRule="auto"/>
+        <w:jc w:val="both"/>
+        <w:textAlignment w:val="top"/>
+      </w:pPr>
+      <w:r>
         <w:lastRenderedPageBreak/>
-        <w:t>бо спочатку благословив їх Христос.</w:t>
-      </w:r>
-    </w:p>
-    <w:p>
-      <w:pPr>
-        <w:pStyle w:val="cdt4ke"/>
-        <w:spacing w:before="225" w:beforeAutospacing="0" w:after="0" w:afterAutospacing="0" w:line="276" w:lineRule="auto"/>
-        <w:jc w:val="both"/>
-        <w:textAlignment w:val="top"/>
-      </w:pPr>
-      <w:r>
-        <w:t>На весіллі у Кані Галилейській як людина Він їв і перетворив воду на вино,</w:t>
-      </w:r>
-    </w:p>
-    <w:p>
-      <w:pPr>
-        <w:pStyle w:val="cdt4ke"/>
-        <w:spacing w:before="225" w:beforeAutospacing="0" w:after="0" w:afterAutospacing="0" w:line="276" w:lineRule="auto"/>
-        <w:jc w:val="both"/>
-        <w:textAlignment w:val="top"/>
-      </w:pPr>
-      <w:r>
         <w:t>являючи перше чудо, щоб ти, душе, змінилася.</w:t>
       </w:r>
     </w:p>
@@ -5934,45 +5833,45 @@
           <w:sz w:val="24"/>
           <w:szCs w:val="24"/>
         </w:rPr>
+        <w:t>Жертвуйте жертви справедливі,* і на Господа надійтесь.</w:t>
+      </w:r>
+    </w:p>
+    <w:p>
+      <w:pPr>
+        <w:spacing w:line="276" w:lineRule="auto"/>
+        <w:jc w:val="both"/>
+        <w:rPr>
+          <w:rFonts w:ascii="Times New Roman" w:hAnsi="Times New Roman" w:cs="Times New Roman"/>
+          <w:sz w:val="24"/>
+          <w:szCs w:val="24"/>
+        </w:rPr>
+      </w:pPr>
+      <w:r>
+        <w:rPr>
+          <w:rFonts w:ascii="Times New Roman" w:hAnsi="Times New Roman" w:cs="Times New Roman"/>
+          <w:sz w:val="24"/>
+          <w:szCs w:val="24"/>
+        </w:rPr>
+        <w:t>Багато кажуть: «Хто нам покаже блага?»* Появи нам, Господи, світло лиця твого!</w:t>
+      </w:r>
+    </w:p>
+    <w:p>
+      <w:pPr>
+        <w:spacing w:line="276" w:lineRule="auto"/>
+        <w:jc w:val="both"/>
+        <w:rPr>
+          <w:rFonts w:ascii="Times New Roman" w:hAnsi="Times New Roman" w:cs="Times New Roman"/>
+          <w:sz w:val="24"/>
+          <w:szCs w:val="24"/>
+        </w:rPr>
+      </w:pPr>
+      <w:r>
+        <w:rPr>
+          <w:rFonts w:ascii="Times New Roman" w:hAnsi="Times New Roman" w:cs="Times New Roman"/>
+          <w:sz w:val="24"/>
+          <w:szCs w:val="24"/>
+        </w:rPr>
         <w:lastRenderedPageBreak/>
-        <w:t>Жертвуйте жертви справедливі,* і на Господа надійтесь.</w:t>
-      </w:r>
-    </w:p>
-    <w:p>
-      <w:pPr>
-        <w:spacing w:line="276" w:lineRule="auto"/>
-        <w:jc w:val="both"/>
-        <w:rPr>
-          <w:rFonts w:ascii="Times New Roman" w:hAnsi="Times New Roman" w:cs="Times New Roman"/>
-          <w:sz w:val="24"/>
-          <w:szCs w:val="24"/>
-        </w:rPr>
-      </w:pPr>
-      <w:r>
-        <w:rPr>
-          <w:rFonts w:ascii="Times New Roman" w:hAnsi="Times New Roman" w:cs="Times New Roman"/>
-          <w:sz w:val="24"/>
-          <w:szCs w:val="24"/>
-        </w:rPr>
-        <w:t>Багато кажуть: «Хто нам покаже блага?»* Появи нам, Господи, світло лиця твого!</w:t>
-      </w:r>
-    </w:p>
-    <w:p>
-      <w:pPr>
-        <w:spacing w:line="276" w:lineRule="auto"/>
-        <w:jc w:val="both"/>
-        <w:rPr>
-          <w:rFonts w:ascii="Times New Roman" w:hAnsi="Times New Roman" w:cs="Times New Roman"/>
-          <w:sz w:val="24"/>
-          <w:szCs w:val="24"/>
-        </w:rPr>
-      </w:pPr>
-      <w:r>
-        <w:rPr>
-          <w:rFonts w:ascii="Times New Roman" w:hAnsi="Times New Roman" w:cs="Times New Roman"/>
-          <w:sz w:val="24"/>
-          <w:szCs w:val="24"/>
-        </w:rPr>
         <w:t>Дав ти моєму серцю радість більшу,* ніж рáдість тих, що їм уродило удóзвіль вина й хліба.</w:t>
       </w:r>
     </w:p>
@@ -6445,7 +6344,6 @@
         <w:t>Слава Отцю, і Сину, і Святому Духові, і нині, і повсякчас, і на віки віків. Амінь.</w:t>
       </w:r>
     </w:p>
-    <w:bookmarkEnd w:id="3"/>
     <w:p>
       <w:pPr>
         <w:spacing w:line="276" w:lineRule="auto"/>
@@ -6542,45 +6440,45 @@
           <w:sz w:val="24"/>
           <w:szCs w:val="24"/>
         </w:rPr>
+        <w:t>Вкажи менí, Господи, твої дороги,* навчи мене, де твої стежки.</w:t>
+      </w:r>
+    </w:p>
+    <w:p>
+      <w:pPr>
+        <w:spacing w:line="276" w:lineRule="auto"/>
+        <w:jc w:val="both"/>
+        <w:rPr>
+          <w:rFonts w:ascii="Times New Roman" w:hAnsi="Times New Roman" w:cs="Times New Roman"/>
+          <w:sz w:val="24"/>
+          <w:szCs w:val="24"/>
+        </w:rPr>
+      </w:pPr>
+      <w:r>
+        <w:rPr>
+          <w:rFonts w:ascii="Times New Roman" w:hAnsi="Times New Roman" w:cs="Times New Roman"/>
+          <w:sz w:val="24"/>
+          <w:szCs w:val="24"/>
+        </w:rPr>
+        <w:t>Напути мене по твоїй правді й навчи мене,* бо ти Бог, мій Спаситель, тебе очікую увесь день.</w:t>
+      </w:r>
+    </w:p>
+    <w:p>
+      <w:pPr>
+        <w:spacing w:line="276" w:lineRule="auto"/>
+        <w:jc w:val="both"/>
+        <w:rPr>
+          <w:rFonts w:ascii="Times New Roman" w:hAnsi="Times New Roman" w:cs="Times New Roman"/>
+          <w:sz w:val="24"/>
+          <w:szCs w:val="24"/>
+        </w:rPr>
+      </w:pPr>
+      <w:r>
+        <w:rPr>
+          <w:rFonts w:ascii="Times New Roman" w:hAnsi="Times New Roman" w:cs="Times New Roman"/>
+          <w:sz w:val="24"/>
+          <w:szCs w:val="24"/>
+        </w:rPr>
         <w:lastRenderedPageBreak/>
-        <w:t>Вкажи менí, Господи, твої дороги,* навчи мене, де твої стежки.</w:t>
-      </w:r>
-    </w:p>
-    <w:p>
-      <w:pPr>
-        <w:spacing w:line="276" w:lineRule="auto"/>
-        <w:jc w:val="both"/>
-        <w:rPr>
-          <w:rFonts w:ascii="Times New Roman" w:hAnsi="Times New Roman" w:cs="Times New Roman"/>
-          <w:sz w:val="24"/>
-          <w:szCs w:val="24"/>
-        </w:rPr>
-      </w:pPr>
-      <w:r>
-        <w:rPr>
-          <w:rFonts w:ascii="Times New Roman" w:hAnsi="Times New Roman" w:cs="Times New Roman"/>
-          <w:sz w:val="24"/>
-          <w:szCs w:val="24"/>
-        </w:rPr>
-        <w:t>Напути мене по твоїй правді й навчи мене,* бо ти Бог, мій Спаситель, тебе очікую увесь день.</w:t>
-      </w:r>
-    </w:p>
-    <w:p>
-      <w:pPr>
-        <w:spacing w:line="276" w:lineRule="auto"/>
-        <w:jc w:val="both"/>
-        <w:rPr>
-          <w:rFonts w:ascii="Times New Roman" w:hAnsi="Times New Roman" w:cs="Times New Roman"/>
-          <w:sz w:val="24"/>
-          <w:szCs w:val="24"/>
-        </w:rPr>
-      </w:pPr>
-      <w:r>
-        <w:rPr>
-          <w:rFonts w:ascii="Times New Roman" w:hAnsi="Times New Roman" w:cs="Times New Roman"/>
-          <w:sz w:val="24"/>
-          <w:szCs w:val="24"/>
-        </w:rPr>
         <w:t>Згадай про твоє милосердя, Господи,* і про твою милість, вона бо споконвіку.</w:t>
       </w:r>
     </w:p>
@@ -7079,45 +6977,45 @@
           <w:sz w:val="24"/>
           <w:szCs w:val="24"/>
         </w:rPr>
+        <w:t>Змилуйся нáдо мною, Господи, бо менí скрутно;* з журби виснажилися в мене очі, душа моя і нутро моє.</w:t>
+      </w:r>
+    </w:p>
+    <w:p>
+      <w:pPr>
+        <w:spacing w:line="276" w:lineRule="auto"/>
+        <w:jc w:val="both"/>
+        <w:rPr>
+          <w:rFonts w:ascii="Times New Roman" w:hAnsi="Times New Roman" w:cs="Times New Roman"/>
+          <w:sz w:val="24"/>
+          <w:szCs w:val="24"/>
+        </w:rPr>
+      </w:pPr>
+      <w:r>
+        <w:rPr>
+          <w:rFonts w:ascii="Times New Roman" w:hAnsi="Times New Roman" w:cs="Times New Roman"/>
+          <w:sz w:val="24"/>
+          <w:szCs w:val="24"/>
+        </w:rPr>
+        <w:t>Життя моє виснажується в горі, літа мої в стогнанні.* У смутку підупала моя сила, і кості мої повисихáли.</w:t>
+      </w:r>
+    </w:p>
+    <w:p>
+      <w:pPr>
+        <w:spacing w:line="276" w:lineRule="auto"/>
+        <w:jc w:val="both"/>
+        <w:rPr>
+          <w:rFonts w:ascii="Times New Roman" w:hAnsi="Times New Roman" w:cs="Times New Roman"/>
+          <w:sz w:val="24"/>
+          <w:szCs w:val="24"/>
+        </w:rPr>
+      </w:pPr>
+      <w:r>
+        <w:rPr>
+          <w:rFonts w:ascii="Times New Roman" w:hAnsi="Times New Roman" w:cs="Times New Roman"/>
+          <w:sz w:val="24"/>
+          <w:szCs w:val="24"/>
+        </w:rPr>
         <w:lastRenderedPageBreak/>
-        <w:t>Змилуйся нáдо мною, Господи, бо менí скрутно;* з журби виснажилися в мене очі, душа моя і нутро моє.</w:t>
-      </w:r>
-    </w:p>
-    <w:p>
-      <w:pPr>
-        <w:spacing w:line="276" w:lineRule="auto"/>
-        <w:jc w:val="both"/>
-        <w:rPr>
-          <w:rFonts w:ascii="Times New Roman" w:hAnsi="Times New Roman" w:cs="Times New Roman"/>
-          <w:sz w:val="24"/>
-          <w:szCs w:val="24"/>
-        </w:rPr>
-      </w:pPr>
-      <w:r>
-        <w:rPr>
-          <w:rFonts w:ascii="Times New Roman" w:hAnsi="Times New Roman" w:cs="Times New Roman"/>
-          <w:sz w:val="24"/>
-          <w:szCs w:val="24"/>
-        </w:rPr>
-        <w:t>Життя моє виснажується в горі, літа мої в стогнанні.* У смутку підупала моя сила, і кості мої повисихáли.</w:t>
-      </w:r>
-    </w:p>
-    <w:p>
-      <w:pPr>
-        <w:spacing w:line="276" w:lineRule="auto"/>
-        <w:jc w:val="both"/>
-        <w:rPr>
-          <w:rFonts w:ascii="Times New Roman" w:hAnsi="Times New Roman" w:cs="Times New Roman"/>
-          <w:sz w:val="24"/>
-          <w:szCs w:val="24"/>
-        </w:rPr>
-      </w:pPr>
-      <w:r>
-        <w:rPr>
-          <w:rFonts w:ascii="Times New Roman" w:hAnsi="Times New Roman" w:cs="Times New Roman"/>
-          <w:sz w:val="24"/>
-          <w:szCs w:val="24"/>
-        </w:rPr>
         <w:t>Я став сміховиськом усíм моїм противникам і ганьбою моїм сусíдам,* страховищем моїм знайомим; хто мене бачить надворі, утікає від мене.</w:t>
       </w:r>
     </w:p>
@@ -7578,83 +7476,83 @@
           <w:sz w:val="24"/>
           <w:szCs w:val="24"/>
         </w:rPr>
+        <w:t>Ніяке лихо до тебе не приступить,* ніяка кара не підійде близько намету твого.</w:t>
+      </w:r>
+    </w:p>
+    <w:p>
+      <w:pPr>
+        <w:spacing w:line="276" w:lineRule="auto"/>
+        <w:jc w:val="both"/>
+        <w:rPr>
+          <w:rFonts w:ascii="Times New Roman" w:hAnsi="Times New Roman" w:cs="Times New Roman"/>
+          <w:sz w:val="24"/>
+          <w:szCs w:val="24"/>
+        </w:rPr>
+      </w:pPr>
+      <w:r>
+        <w:rPr>
+          <w:rFonts w:ascii="Times New Roman" w:hAnsi="Times New Roman" w:cs="Times New Roman"/>
+          <w:sz w:val="24"/>
+          <w:szCs w:val="24"/>
+        </w:rPr>
+        <w:t>Бо ангелам своїм він повелить про тебе,* щоб берегли тебе на всіх твоїх дорогах.</w:t>
+      </w:r>
+    </w:p>
+    <w:p>
+      <w:pPr>
+        <w:spacing w:line="276" w:lineRule="auto"/>
+        <w:jc w:val="both"/>
+        <w:rPr>
+          <w:rFonts w:ascii="Times New Roman" w:hAnsi="Times New Roman" w:cs="Times New Roman"/>
+          <w:sz w:val="24"/>
+          <w:szCs w:val="24"/>
+        </w:rPr>
+      </w:pPr>
+      <w:r>
+        <w:rPr>
+          <w:rFonts w:ascii="Times New Roman" w:hAnsi="Times New Roman" w:cs="Times New Roman"/>
+          <w:sz w:val="24"/>
+          <w:szCs w:val="24"/>
+        </w:rPr>
+        <w:t>І на руках тебе носитимуть,* щоб не спіткнулася нога твоя об камінь.</w:t>
+      </w:r>
+    </w:p>
+    <w:p>
+      <w:pPr>
+        <w:spacing w:line="276" w:lineRule="auto"/>
+        <w:jc w:val="both"/>
+        <w:rPr>
+          <w:rFonts w:ascii="Times New Roman" w:hAnsi="Times New Roman" w:cs="Times New Roman"/>
+          <w:sz w:val="24"/>
+          <w:szCs w:val="24"/>
+        </w:rPr>
+      </w:pPr>
+      <w:r>
+        <w:rPr>
+          <w:rFonts w:ascii="Times New Roman" w:hAnsi="Times New Roman" w:cs="Times New Roman"/>
+          <w:sz w:val="24"/>
+          <w:szCs w:val="24"/>
+        </w:rPr>
+        <w:t>На гада й змія будеш наступати,* розтопчеш лева й дракона.</w:t>
+      </w:r>
+    </w:p>
+    <w:p>
+      <w:pPr>
+        <w:spacing w:line="276" w:lineRule="auto"/>
+        <w:jc w:val="both"/>
+        <w:rPr>
+          <w:rFonts w:ascii="Times New Roman" w:hAnsi="Times New Roman" w:cs="Times New Roman"/>
+          <w:sz w:val="24"/>
+          <w:szCs w:val="24"/>
+        </w:rPr>
+      </w:pPr>
+      <w:r>
+        <w:rPr>
+          <w:rFonts w:ascii="Times New Roman" w:hAnsi="Times New Roman" w:cs="Times New Roman"/>
+          <w:sz w:val="24"/>
+          <w:szCs w:val="24"/>
+        </w:rPr>
         <w:lastRenderedPageBreak/>
-        <w:t>Ніяке лихо до тебе не приступить,* ніяка кара не підійде близько намету твого.</w:t>
-      </w:r>
-    </w:p>
-    <w:p>
-      <w:pPr>
-        <w:spacing w:line="276" w:lineRule="auto"/>
-        <w:jc w:val="both"/>
-        <w:rPr>
-          <w:rFonts w:ascii="Times New Roman" w:hAnsi="Times New Roman" w:cs="Times New Roman"/>
-          <w:sz w:val="24"/>
-          <w:szCs w:val="24"/>
-        </w:rPr>
-      </w:pPr>
-      <w:r>
-        <w:rPr>
-          <w:rFonts w:ascii="Times New Roman" w:hAnsi="Times New Roman" w:cs="Times New Roman"/>
-          <w:sz w:val="24"/>
-          <w:szCs w:val="24"/>
-        </w:rPr>
-        <w:t>Бо ангелам своїм він повелить про тебе,* щоб берегли тебе на всіх твоїх дорогах.</w:t>
-      </w:r>
-    </w:p>
-    <w:p>
-      <w:pPr>
-        <w:spacing w:line="276" w:lineRule="auto"/>
-        <w:jc w:val="both"/>
-        <w:rPr>
-          <w:rFonts w:ascii="Times New Roman" w:hAnsi="Times New Roman" w:cs="Times New Roman"/>
-          <w:sz w:val="24"/>
-          <w:szCs w:val="24"/>
-        </w:rPr>
-      </w:pPr>
-      <w:r>
-        <w:rPr>
-          <w:rFonts w:ascii="Times New Roman" w:hAnsi="Times New Roman" w:cs="Times New Roman"/>
-          <w:sz w:val="24"/>
-          <w:szCs w:val="24"/>
-        </w:rPr>
-        <w:t>І на руках тебе носитимуть,* щоб не спіткнулася нога твоя об камінь.</w:t>
-      </w:r>
-    </w:p>
-    <w:p>
-      <w:pPr>
-        <w:spacing w:line="276" w:lineRule="auto"/>
-        <w:jc w:val="both"/>
-        <w:rPr>
-          <w:rFonts w:ascii="Times New Roman" w:hAnsi="Times New Roman" w:cs="Times New Roman"/>
-          <w:sz w:val="24"/>
-          <w:szCs w:val="24"/>
-        </w:rPr>
-      </w:pPr>
-      <w:r>
-        <w:rPr>
-          <w:rFonts w:ascii="Times New Roman" w:hAnsi="Times New Roman" w:cs="Times New Roman"/>
-          <w:sz w:val="24"/>
-          <w:szCs w:val="24"/>
-        </w:rPr>
-        <w:t>На гада й змія будеш наступати,* розтопчеш лева й дракона.</w:t>
-      </w:r>
-    </w:p>
-    <w:p>
-      <w:pPr>
-        <w:spacing w:line="276" w:lineRule="auto"/>
-        <w:jc w:val="both"/>
-        <w:rPr>
-          <w:rFonts w:ascii="Times New Roman" w:hAnsi="Times New Roman" w:cs="Times New Roman"/>
-          <w:sz w:val="24"/>
-          <w:szCs w:val="24"/>
-        </w:rPr>
-      </w:pPr>
-      <w:r>
-        <w:rPr>
-          <w:rFonts w:ascii="Times New Roman" w:hAnsi="Times New Roman" w:cs="Times New Roman"/>
-          <w:sz w:val="24"/>
-          <w:szCs w:val="24"/>
-        </w:rPr>
         <w:t>Тому, що він виявив свою любов до мене, я його врятую;* я вивищу його, бо він знає моє ім’я.</w:t>
       </w:r>
     </w:p>
@@ -8270,83 +8168,83 @@
           <w:sz w:val="24"/>
           <w:szCs w:val="24"/>
         </w:rPr>
+        <w:t>Влада на плечах у нього: Бо з нами Бог.</w:t>
+      </w:r>
+    </w:p>
+    <w:p>
+      <w:pPr>
+        <w:spacing w:line="276" w:lineRule="auto"/>
+        <w:jc w:val="both"/>
+        <w:rPr>
+          <w:rFonts w:ascii="Times New Roman" w:hAnsi="Times New Roman" w:cs="Times New Roman"/>
+          <w:sz w:val="24"/>
+          <w:szCs w:val="24"/>
+        </w:rPr>
+      </w:pPr>
+      <w:r>
+        <w:rPr>
+          <w:rFonts w:ascii="Times New Roman" w:hAnsi="Times New Roman" w:cs="Times New Roman"/>
+          <w:sz w:val="24"/>
+          <w:szCs w:val="24"/>
+        </w:rPr>
+        <w:t>І дадуть йому ім’я: Чудесний порадник: Бо з нами Бог.</w:t>
+      </w:r>
+    </w:p>
+    <w:p>
+      <w:pPr>
+        <w:spacing w:line="276" w:lineRule="auto"/>
+        <w:jc w:val="both"/>
+        <w:rPr>
+          <w:rFonts w:ascii="Times New Roman" w:hAnsi="Times New Roman" w:cs="Times New Roman"/>
+          <w:sz w:val="24"/>
+          <w:szCs w:val="24"/>
+        </w:rPr>
+      </w:pPr>
+      <w:r>
+        <w:rPr>
+          <w:rFonts w:ascii="Times New Roman" w:hAnsi="Times New Roman" w:cs="Times New Roman"/>
+          <w:sz w:val="24"/>
+          <w:szCs w:val="24"/>
+        </w:rPr>
+        <w:t>Сильний Бог, Отець довічний, Князь миру: Бо з нами Бог.</w:t>
+      </w:r>
+    </w:p>
+    <w:p>
+      <w:pPr>
+        <w:spacing w:line="276" w:lineRule="auto"/>
+        <w:jc w:val="both"/>
+        <w:rPr>
+          <w:rFonts w:ascii="Times New Roman" w:hAnsi="Times New Roman" w:cs="Times New Roman"/>
+          <w:sz w:val="24"/>
+          <w:szCs w:val="24"/>
+        </w:rPr>
+      </w:pPr>
+      <w:r>
+        <w:rPr>
+          <w:rFonts w:ascii="Times New Roman" w:hAnsi="Times New Roman" w:cs="Times New Roman"/>
+          <w:sz w:val="24"/>
+          <w:szCs w:val="24"/>
+        </w:rPr>
+        <w:t>Слава Отцю і Сину, і Святому Духові: Бо з нами Бог.</w:t>
+      </w:r>
+    </w:p>
+    <w:p>
+      <w:pPr>
+        <w:spacing w:line="276" w:lineRule="auto"/>
+        <w:jc w:val="both"/>
+        <w:rPr>
+          <w:rFonts w:ascii="Times New Roman" w:hAnsi="Times New Roman" w:cs="Times New Roman"/>
+          <w:sz w:val="24"/>
+          <w:szCs w:val="24"/>
+        </w:rPr>
+      </w:pPr>
+      <w:r>
+        <w:rPr>
+          <w:rFonts w:ascii="Times New Roman" w:hAnsi="Times New Roman" w:cs="Times New Roman"/>
+          <w:sz w:val="24"/>
+          <w:szCs w:val="24"/>
+        </w:rPr>
         <w:lastRenderedPageBreak/>
-        <w:t>Влада на плечах у нього: Бо з нами Бог.</w:t>
-      </w:r>
-    </w:p>
-    <w:p>
-      <w:pPr>
-        <w:spacing w:line="276" w:lineRule="auto"/>
-        <w:jc w:val="both"/>
-        <w:rPr>
-          <w:rFonts w:ascii="Times New Roman" w:hAnsi="Times New Roman" w:cs="Times New Roman"/>
-          <w:sz w:val="24"/>
-          <w:szCs w:val="24"/>
-        </w:rPr>
-      </w:pPr>
-      <w:r>
-        <w:rPr>
-          <w:rFonts w:ascii="Times New Roman" w:hAnsi="Times New Roman" w:cs="Times New Roman"/>
-          <w:sz w:val="24"/>
-          <w:szCs w:val="24"/>
-        </w:rPr>
-        <w:t>І дадуть йому ім’я: Чудесний порадник: Бо з нами Бог.</w:t>
-      </w:r>
-    </w:p>
-    <w:p>
-      <w:pPr>
-        <w:spacing w:line="276" w:lineRule="auto"/>
-        <w:jc w:val="both"/>
-        <w:rPr>
-          <w:rFonts w:ascii="Times New Roman" w:hAnsi="Times New Roman" w:cs="Times New Roman"/>
-          <w:sz w:val="24"/>
-          <w:szCs w:val="24"/>
-        </w:rPr>
-      </w:pPr>
-      <w:r>
-        <w:rPr>
-          <w:rFonts w:ascii="Times New Roman" w:hAnsi="Times New Roman" w:cs="Times New Roman"/>
-          <w:sz w:val="24"/>
-          <w:szCs w:val="24"/>
-        </w:rPr>
-        <w:t>Сильний Бог, Отець довічний, Князь миру: Бо з нами Бог.</w:t>
-      </w:r>
-    </w:p>
-    <w:p>
-      <w:pPr>
-        <w:spacing w:line="276" w:lineRule="auto"/>
-        <w:jc w:val="both"/>
-        <w:rPr>
-          <w:rFonts w:ascii="Times New Roman" w:hAnsi="Times New Roman" w:cs="Times New Roman"/>
-          <w:sz w:val="24"/>
-          <w:szCs w:val="24"/>
-        </w:rPr>
-      </w:pPr>
-      <w:r>
-        <w:rPr>
-          <w:rFonts w:ascii="Times New Roman" w:hAnsi="Times New Roman" w:cs="Times New Roman"/>
-          <w:sz w:val="24"/>
-          <w:szCs w:val="24"/>
-        </w:rPr>
-        <w:t>Слава Отцю і Сину, і Святому Духові: Бо з нами Бог.</w:t>
-      </w:r>
-    </w:p>
-    <w:p>
-      <w:pPr>
-        <w:spacing w:line="276" w:lineRule="auto"/>
-        <w:jc w:val="both"/>
-        <w:rPr>
-          <w:rFonts w:ascii="Times New Roman" w:hAnsi="Times New Roman" w:cs="Times New Roman"/>
-          <w:sz w:val="24"/>
-          <w:szCs w:val="24"/>
-        </w:rPr>
-      </w:pPr>
-      <w:r>
-        <w:rPr>
-          <w:rFonts w:ascii="Times New Roman" w:hAnsi="Times New Roman" w:cs="Times New Roman"/>
-          <w:sz w:val="24"/>
-          <w:szCs w:val="24"/>
-        </w:rPr>
         <w:t>І нині і повсякчас, і на віки віків. Амінь. Бо з нами Бог.</w:t>
       </w:r>
     </w:p>
@@ -8555,211 +8453,249 @@
     </w:p>
     <w:p>
       <w:pPr>
-        <w:spacing w:line="276" w:lineRule="auto"/>
-        <w:jc w:val="both"/>
-        <w:rPr>
-          <w:rFonts w:ascii="Times New Roman" w:hAnsi="Times New Roman" w:cs="Times New Roman"/>
-          <w:sz w:val="24"/>
-          <w:szCs w:val="24"/>
-        </w:rPr>
-      </w:pPr>
-      <w:r>
-        <w:rPr>
-          <w:rFonts w:ascii="Times New Roman" w:hAnsi="Times New Roman" w:cs="Times New Roman"/>
-          <w:sz w:val="24"/>
-          <w:szCs w:val="24"/>
+        <w:pStyle w:val="NormalWeb"/>
+        <w:spacing w:before="0" w:beforeAutospacing="0" w:after="160" w:afterAutospacing="0"/>
+        <w:jc w:val="both"/>
+      </w:pPr>
+      <w:r>
+        <w:rPr>
+          <w:color w:val="000000"/>
         </w:rPr>
         <w:t>Вірую в єдиного Бога Отця, вседержителя, творця неба і землі, і всього видимого і невидимого.</w:t>
       </w:r>
     </w:p>
     <w:p>
       <w:pPr>
-        <w:spacing w:line="276" w:lineRule="auto"/>
-        <w:jc w:val="both"/>
-        <w:rPr>
-          <w:rFonts w:ascii="Times New Roman" w:hAnsi="Times New Roman" w:cs="Times New Roman"/>
-          <w:sz w:val="24"/>
-          <w:szCs w:val="24"/>
-        </w:rPr>
-      </w:pPr>
-      <w:r>
-        <w:rPr>
-          <w:rFonts w:ascii="Times New Roman" w:hAnsi="Times New Roman" w:cs="Times New Roman"/>
-          <w:sz w:val="24"/>
-          <w:szCs w:val="24"/>
+        <w:pStyle w:val="NormalWeb"/>
+        <w:spacing w:before="0" w:beforeAutospacing="0" w:after="160" w:afterAutospacing="0"/>
+        <w:jc w:val="both"/>
+      </w:pPr>
+      <w:r>
+        <w:rPr>
+          <w:color w:val="000000"/>
         </w:rPr>
         <w:t>І в єдиного Господа Ісуса Христа, Сина Божого, єдинородного, від Отця родженого перед усіма віками.</w:t>
       </w:r>
     </w:p>
     <w:p>
       <w:pPr>
-        <w:spacing w:line="276" w:lineRule="auto"/>
-        <w:jc w:val="both"/>
-        <w:rPr>
-          <w:rFonts w:ascii="Times New Roman" w:hAnsi="Times New Roman" w:cs="Times New Roman"/>
-          <w:sz w:val="24"/>
-          <w:szCs w:val="24"/>
-        </w:rPr>
-      </w:pPr>
-      <w:r>
-        <w:rPr>
-          <w:rFonts w:ascii="Times New Roman" w:hAnsi="Times New Roman" w:cs="Times New Roman"/>
-          <w:sz w:val="24"/>
-          <w:szCs w:val="24"/>
-        </w:rPr>
-        <w:t>Світло від світла, Бога істинного від Бога істинного, родженого, несотвореного, єдиносущного з Отцем, що через нього все сталося.</w:t>
-      </w:r>
-    </w:p>
-    <w:p>
-      <w:pPr>
-        <w:spacing w:line="276" w:lineRule="auto"/>
-        <w:jc w:val="both"/>
-        <w:rPr>
-          <w:rFonts w:ascii="Times New Roman" w:hAnsi="Times New Roman" w:cs="Times New Roman"/>
-          <w:sz w:val="24"/>
-          <w:szCs w:val="24"/>
-        </w:rPr>
-      </w:pPr>
-      <w:r>
-        <w:rPr>
-          <w:rFonts w:ascii="Times New Roman" w:hAnsi="Times New Roman" w:cs="Times New Roman"/>
-          <w:sz w:val="24"/>
-          <w:szCs w:val="24"/>
-        </w:rPr>
-        <w:t>Він задля нас людей і нашого ради спасіння зійшов із небес, і воплотився з Духа Святого і Марії Діви, і стався чоловіком.</w:t>
-      </w:r>
-    </w:p>
-    <w:p>
-      <w:pPr>
-        <w:spacing w:line="276" w:lineRule="auto"/>
-        <w:jc w:val="both"/>
-        <w:rPr>
-          <w:rFonts w:ascii="Times New Roman" w:hAnsi="Times New Roman" w:cs="Times New Roman"/>
-          <w:sz w:val="24"/>
-          <w:szCs w:val="24"/>
-        </w:rPr>
-      </w:pPr>
-      <w:r>
-        <w:rPr>
-          <w:rFonts w:ascii="Times New Roman" w:hAnsi="Times New Roman" w:cs="Times New Roman"/>
-          <w:sz w:val="24"/>
-          <w:szCs w:val="24"/>
+        <w:pStyle w:val="NormalWeb"/>
+        <w:spacing w:before="0" w:beforeAutospacing="0" w:after="160" w:afterAutospacing="0"/>
+        <w:jc w:val="both"/>
+      </w:pPr>
+      <w:r>
+        <w:rPr>
+          <w:color w:val="000000"/>
+        </w:rPr>
+        <w:t>Світло від світла, Бога істинного від Бога істинного, родженого, несотвореного, єдиносущного з Отцем, що через нього все постало.</w:t>
+      </w:r>
+    </w:p>
+    <w:p>
+      <w:pPr>
+        <w:pStyle w:val="NormalWeb"/>
+        <w:spacing w:before="0" w:beforeAutospacing="0" w:after="160" w:afterAutospacing="0"/>
+        <w:jc w:val="both"/>
+      </w:pPr>
+      <w:r>
+        <w:rPr>
+          <w:color w:val="000000"/>
+        </w:rPr>
+        <w:t>Він задля нас людей і нашого ради спасіння зійшов із небес, і воплотився з Духа Святого і Марії Діви, і став людиною.</w:t>
+      </w:r>
+    </w:p>
+    <w:p>
+      <w:pPr>
+        <w:pStyle w:val="NormalWeb"/>
+        <w:spacing w:before="0" w:beforeAutospacing="0" w:after="160" w:afterAutospacing="0"/>
+        <w:jc w:val="both"/>
+      </w:pPr>
+      <w:r>
+        <w:rPr>
+          <w:color w:val="000000"/>
         </w:rPr>
         <w:t>І був розп’ятий за нас, за Понтія Пилата, і страждав, і був похований.</w:t>
       </w:r>
     </w:p>
     <w:p>
       <w:pPr>
-        <w:spacing w:line="276" w:lineRule="auto"/>
-        <w:jc w:val="both"/>
-        <w:rPr>
-          <w:rFonts w:ascii="Times New Roman" w:hAnsi="Times New Roman" w:cs="Times New Roman"/>
-          <w:sz w:val="24"/>
-          <w:szCs w:val="24"/>
-        </w:rPr>
-      </w:pPr>
-      <w:r>
-        <w:rPr>
-          <w:rFonts w:ascii="Times New Roman" w:hAnsi="Times New Roman" w:cs="Times New Roman"/>
-          <w:sz w:val="24"/>
-          <w:szCs w:val="24"/>
+        <w:pStyle w:val="NormalWeb"/>
+        <w:spacing w:before="0" w:beforeAutospacing="0" w:after="160" w:afterAutospacing="0"/>
+        <w:jc w:val="both"/>
+      </w:pPr>
+      <w:r>
+        <w:rPr>
+          <w:color w:val="000000"/>
         </w:rPr>
         <w:t>І воскрес у третій день, згідно з Писанням.</w:t>
       </w:r>
     </w:p>
     <w:p>
       <w:pPr>
-        <w:spacing w:line="276" w:lineRule="auto"/>
-        <w:jc w:val="both"/>
-        <w:rPr>
-          <w:rFonts w:ascii="Times New Roman" w:hAnsi="Times New Roman" w:cs="Times New Roman"/>
-          <w:sz w:val="24"/>
-          <w:szCs w:val="24"/>
-        </w:rPr>
-      </w:pPr>
-      <w:r>
-        <w:rPr>
-          <w:rFonts w:ascii="Times New Roman" w:hAnsi="Times New Roman" w:cs="Times New Roman"/>
-          <w:sz w:val="24"/>
-          <w:szCs w:val="24"/>
+        <w:pStyle w:val="NormalWeb"/>
+        <w:spacing w:before="0" w:beforeAutospacing="0" w:after="160" w:afterAutospacing="0"/>
+        <w:jc w:val="both"/>
+      </w:pPr>
+      <w:r>
+        <w:rPr>
+          <w:color w:val="000000"/>
         </w:rPr>
         <w:t>І вознісся на небо, і сидить праворуч Отця.</w:t>
       </w:r>
     </w:p>
     <w:p>
       <w:pPr>
-        <w:spacing w:line="276" w:lineRule="auto"/>
-        <w:jc w:val="both"/>
-        <w:rPr>
-          <w:rFonts w:ascii="Times New Roman" w:hAnsi="Times New Roman" w:cs="Times New Roman"/>
-          <w:sz w:val="24"/>
-          <w:szCs w:val="24"/>
-        </w:rPr>
-      </w:pPr>
-      <w:r>
-        <w:rPr>
-          <w:rFonts w:ascii="Times New Roman" w:hAnsi="Times New Roman" w:cs="Times New Roman"/>
-          <w:sz w:val="24"/>
-          <w:szCs w:val="24"/>
+        <w:pStyle w:val="NormalWeb"/>
+        <w:spacing w:before="0" w:beforeAutospacing="0" w:after="160" w:afterAutospacing="0"/>
+        <w:jc w:val="both"/>
+      </w:pPr>
+      <w:r>
+        <w:rPr>
+          <w:color w:val="000000"/>
         </w:rPr>
         <w:t>І вдруге прийде зі славою судити живих і мертвих, а його царству не буде кінця.</w:t>
       </w:r>
     </w:p>
     <w:p>
       <w:pPr>
-        <w:spacing w:line="276" w:lineRule="auto"/>
-        <w:jc w:val="both"/>
-        <w:rPr>
-          <w:rFonts w:ascii="Times New Roman" w:hAnsi="Times New Roman" w:cs="Times New Roman"/>
-          <w:sz w:val="24"/>
-          <w:szCs w:val="24"/>
-        </w:rPr>
-      </w:pPr>
-      <w:r>
-        <w:rPr>
-          <w:rFonts w:ascii="Times New Roman" w:hAnsi="Times New Roman" w:cs="Times New Roman"/>
-          <w:sz w:val="24"/>
-          <w:szCs w:val="24"/>
-        </w:rPr>
-        <w:t xml:space="preserve">І в Духа Святого, Господа животворящого, що від Отця </w:t>
-      </w:r>
-      <w:r>
-        <w:rPr>
-          <w:rFonts w:ascii="Times New Roman" w:hAnsi="Times New Roman" w:cs="Times New Roman"/>
-          <w:color w:val="FF0000"/>
-          <w:sz w:val="24"/>
-          <w:szCs w:val="24"/>
+        <w:pStyle w:val="NormalWeb"/>
+        <w:spacing w:before="0" w:beforeAutospacing="0" w:after="160" w:afterAutospacing="0"/>
+        <w:jc w:val="both"/>
+      </w:pPr>
+      <w:r>
+        <w:rPr>
+          <w:color w:val="000000"/>
+        </w:rPr>
+        <w:t xml:space="preserve">І в Духа Святого, Господа животворчого, що від Отця </w:t>
+      </w:r>
+      <w:r>
+        <w:rPr>
+          <w:color w:val="FF0000"/>
         </w:rPr>
         <w:t>[</w:t>
       </w:r>
       <w:r>
         <w:rPr>
-          <w:rFonts w:ascii="Times New Roman" w:hAnsi="Times New Roman" w:cs="Times New Roman"/>
-          <w:sz w:val="24"/>
-          <w:szCs w:val="24"/>
+          <w:color w:val="000000"/>
         </w:rPr>
         <w:t>і Сина</w:t>
       </w:r>
       <w:r>
         <w:rPr>
-          <w:rFonts w:ascii="Times New Roman" w:hAnsi="Times New Roman" w:cs="Times New Roman"/>
-          <w:color w:val="FF0000"/>
-          <w:sz w:val="24"/>
-          <w:szCs w:val="24"/>
+          <w:color w:val="FF0000"/>
         </w:rPr>
         <w:t>]</w:t>
       </w:r>
       <w:r>
         <w:rPr>
-          <w:rFonts w:ascii="Times New Roman" w:hAnsi="Times New Roman" w:cs="Times New Roman"/>
-          <w:sz w:val="24"/>
-          <w:szCs w:val="24"/>
+          <w:color w:val="000000"/>
         </w:rPr>
         <w:t xml:space="preserve"> ісходить, що з Отцем і Сином рівнопоклоняємий і рівнославимий, що говорив через пророків.</w:t>
       </w:r>
     </w:p>
     <w:p>
       <w:pPr>
+        <w:pStyle w:val="NormalWeb"/>
+        <w:spacing w:before="0" w:beforeAutospacing="0" w:after="160" w:afterAutospacing="0"/>
+        <w:jc w:val="both"/>
+      </w:pPr>
+      <w:r>
+        <w:rPr>
+          <w:color w:val="000000"/>
+        </w:rPr>
+        <w:t>В єдину, святу, соборну й апостольську Церкву.</w:t>
+      </w:r>
+    </w:p>
+    <w:p>
+      <w:pPr>
+        <w:pStyle w:val="NormalWeb"/>
+        <w:spacing w:before="0" w:beforeAutospacing="0" w:after="160" w:afterAutospacing="0"/>
+        <w:jc w:val="both"/>
+      </w:pPr>
+      <w:r>
+        <w:rPr>
+          <w:color w:val="000000"/>
+        </w:rPr>
+        <w:t>Ісповідую одне хрещення на відпущення гріхів.</w:t>
+      </w:r>
+    </w:p>
+    <w:p>
+      <w:pPr>
+        <w:pStyle w:val="NormalWeb"/>
+        <w:spacing w:before="0" w:beforeAutospacing="0" w:after="160" w:afterAutospacing="0"/>
+        <w:jc w:val="both"/>
+      </w:pPr>
+      <w:r>
+        <w:rPr>
+          <w:color w:val="000000"/>
+        </w:rPr>
+        <w:t>Очікую воскресіння мертвих, і життя майбутнього віку. Амінь.</w:t>
+      </w:r>
+    </w:p>
+    <w:p>
+      <w:pPr>
+        <w:spacing w:line="276" w:lineRule="auto"/>
+        <w:jc w:val="center"/>
+        <w:rPr>
+          <w:rFonts w:ascii="Times New Roman" w:hAnsi="Times New Roman" w:cs="Times New Roman"/>
+          <w:color w:val="FF0000"/>
+          <w:sz w:val="24"/>
+          <w:szCs w:val="24"/>
+        </w:rPr>
+      </w:pPr>
+      <w:r>
+        <w:rPr>
+          <w:rFonts w:ascii="Times New Roman" w:hAnsi="Times New Roman" w:cs="Times New Roman"/>
+          <w:i/>
+          <w:iCs/>
+          <w:color w:val="FF0000"/>
+          <w:sz w:val="24"/>
+          <w:szCs w:val="24"/>
+        </w:rPr>
+        <w:t>Молебні стихи (з малими поклонами)</w:t>
+      </w:r>
+    </w:p>
+    <w:p>
+      <w:pPr>
+        <w:spacing w:line="276" w:lineRule="auto"/>
+        <w:jc w:val="both"/>
+        <w:rPr>
+          <w:rFonts w:ascii="Times New Roman" w:hAnsi="Times New Roman" w:cs="Times New Roman"/>
+          <w:sz w:val="24"/>
+          <w:szCs w:val="24"/>
+        </w:rPr>
+      </w:pPr>
+      <w:r>
+        <w:rPr>
+          <w:rFonts w:ascii="Times New Roman" w:hAnsi="Times New Roman" w:cs="Times New Roman"/>
+          <w:sz w:val="24"/>
+          <w:szCs w:val="24"/>
+        </w:rPr>
+        <w:t xml:space="preserve">Пресвята Владичице Богородице, моли Бога за нас, грíшних </w:t>
+      </w:r>
+      <w:r>
+        <w:rPr>
+          <w:rFonts w:ascii="Times New Roman" w:hAnsi="Times New Roman" w:cs="Times New Roman"/>
+          <w:i/>
+          <w:iCs/>
+          <w:color w:val="FF0000"/>
+          <w:sz w:val="24"/>
+          <w:szCs w:val="24"/>
+        </w:rPr>
+        <w:t>(3 р.)</w:t>
+      </w:r>
+      <w:r>
+        <w:rPr>
+          <w:rFonts w:ascii="Times New Roman" w:hAnsi="Times New Roman" w:cs="Times New Roman"/>
+          <w:i/>
+          <w:iCs/>
+          <w:sz w:val="24"/>
+          <w:szCs w:val="24"/>
+        </w:rPr>
+        <w:t>.</w:t>
+      </w:r>
+    </w:p>
+    <w:p>
+      <w:pPr>
         <w:spacing w:line="276" w:lineRule="auto"/>
         <w:jc w:val="both"/>
         <w:rPr>
@@ -8775,133 +8711,615 @@
           <w:szCs w:val="24"/>
         </w:rPr>
         <w:lastRenderedPageBreak/>
-        <w:t>В єдину, святу, соборну й апостольську Церкву.</w:t>
-      </w:r>
-    </w:p>
-    <w:p>
-      <w:pPr>
-        <w:spacing w:line="276" w:lineRule="auto"/>
-        <w:jc w:val="both"/>
-        <w:rPr>
-          <w:rFonts w:ascii="Times New Roman" w:hAnsi="Times New Roman" w:cs="Times New Roman"/>
-          <w:sz w:val="24"/>
-          <w:szCs w:val="24"/>
-        </w:rPr>
-      </w:pPr>
-      <w:r>
-        <w:rPr>
-          <w:rFonts w:ascii="Times New Roman" w:hAnsi="Times New Roman" w:cs="Times New Roman"/>
-          <w:sz w:val="24"/>
-          <w:szCs w:val="24"/>
-        </w:rPr>
-        <w:t>Ісповідую одне хрещення на відпущення гріхів.</w:t>
-      </w:r>
-    </w:p>
-    <w:p>
-      <w:pPr>
-        <w:spacing w:line="276" w:lineRule="auto"/>
-        <w:jc w:val="both"/>
-        <w:rPr>
-          <w:rFonts w:ascii="Times New Roman" w:hAnsi="Times New Roman" w:cs="Times New Roman"/>
-          <w:sz w:val="24"/>
-          <w:szCs w:val="24"/>
-        </w:rPr>
-      </w:pPr>
-      <w:r>
-        <w:rPr>
-          <w:rFonts w:ascii="Times New Roman" w:hAnsi="Times New Roman" w:cs="Times New Roman"/>
-          <w:sz w:val="24"/>
-          <w:szCs w:val="24"/>
-        </w:rPr>
-        <w:t>Очікую воскресіння мертвих, і життя будучого віку. Амінь.</w:t>
-      </w:r>
-    </w:p>
-    <w:p>
-      <w:pPr>
-        <w:spacing w:line="276" w:lineRule="auto"/>
-        <w:jc w:val="center"/>
-        <w:rPr>
-          <w:rFonts w:ascii="Times New Roman" w:hAnsi="Times New Roman" w:cs="Times New Roman"/>
-          <w:color w:val="FF0000"/>
-          <w:sz w:val="24"/>
-          <w:szCs w:val="24"/>
-        </w:rPr>
-      </w:pPr>
-      <w:r>
-        <w:rPr>
-          <w:rFonts w:ascii="Times New Roman" w:hAnsi="Times New Roman" w:cs="Times New Roman"/>
-          <w:i/>
-          <w:iCs/>
-          <w:color w:val="FF0000"/>
-          <w:sz w:val="24"/>
-          <w:szCs w:val="24"/>
-        </w:rPr>
-        <w:t>Молебні стихи (з малими поклонами)</w:t>
-      </w:r>
-    </w:p>
-    <w:p>
-      <w:pPr>
-        <w:spacing w:line="276" w:lineRule="auto"/>
-        <w:jc w:val="both"/>
-        <w:rPr>
-          <w:rFonts w:ascii="Times New Roman" w:hAnsi="Times New Roman" w:cs="Times New Roman"/>
-          <w:sz w:val="24"/>
-          <w:szCs w:val="24"/>
-        </w:rPr>
-      </w:pPr>
-      <w:r>
-        <w:rPr>
-          <w:rFonts w:ascii="Times New Roman" w:hAnsi="Times New Roman" w:cs="Times New Roman"/>
-          <w:sz w:val="24"/>
-          <w:szCs w:val="24"/>
-        </w:rPr>
-        <w:t xml:space="preserve">Пресвята Владичице Богородице, моли Бога за нас, грíшних </w:t>
-      </w:r>
-      <w:r>
-        <w:rPr>
-          <w:rFonts w:ascii="Times New Roman" w:hAnsi="Times New Roman" w:cs="Times New Roman"/>
-          <w:i/>
-          <w:iCs/>
-          <w:color w:val="FF0000"/>
-          <w:sz w:val="24"/>
-          <w:szCs w:val="24"/>
+        <w:t>Усí небесні сили святих Ангелів і Архангелів, молíте Бога за нас, грішних</w:t>
+      </w:r>
+      <w:r>
+        <w:rPr>
+          <w:rFonts w:ascii="Times New Roman" w:hAnsi="Times New Roman" w:cs="Times New Roman"/>
+          <w:i/>
+          <w:iCs/>
+          <w:sz w:val="24"/>
+          <w:szCs w:val="24"/>
+        </w:rPr>
+        <w:t xml:space="preserve"> </w:t>
+      </w:r>
+      <w:r>
+        <w:rPr>
+          <w:rFonts w:ascii="Times New Roman" w:hAnsi="Times New Roman" w:cs="Times New Roman"/>
+          <w:i/>
+          <w:iCs/>
+          <w:color w:val="FF0000"/>
+          <w:sz w:val="24"/>
+          <w:szCs w:val="24"/>
+        </w:rPr>
+        <w:t>(2 р.)</w:t>
+      </w:r>
+      <w:r>
+        <w:rPr>
+          <w:rFonts w:ascii="Times New Roman" w:hAnsi="Times New Roman" w:cs="Times New Roman"/>
+          <w:i/>
+          <w:iCs/>
+          <w:sz w:val="24"/>
+          <w:szCs w:val="24"/>
+        </w:rPr>
+        <w:t>.</w:t>
+      </w:r>
+    </w:p>
+    <w:p>
+      <w:pPr>
+        <w:spacing w:line="276" w:lineRule="auto"/>
+        <w:jc w:val="both"/>
+        <w:rPr>
+          <w:rFonts w:ascii="Times New Roman" w:hAnsi="Times New Roman" w:cs="Times New Roman"/>
+          <w:sz w:val="24"/>
+          <w:szCs w:val="24"/>
+        </w:rPr>
+      </w:pPr>
+      <w:r>
+        <w:rPr>
+          <w:rFonts w:ascii="Times New Roman" w:hAnsi="Times New Roman" w:cs="Times New Roman"/>
+          <w:sz w:val="24"/>
+          <w:szCs w:val="24"/>
+        </w:rPr>
+        <w:t>Святий Іване, пророче і предтéче, і хрестителю Господа нáшого Ісýса Христá, моли Бога за нас, грíшних</w:t>
+      </w:r>
+      <w:r>
+        <w:rPr>
+          <w:rFonts w:ascii="Times New Roman" w:hAnsi="Times New Roman" w:cs="Times New Roman"/>
+          <w:i/>
+          <w:iCs/>
+          <w:sz w:val="24"/>
+          <w:szCs w:val="24"/>
+        </w:rPr>
+        <w:t xml:space="preserve"> </w:t>
+      </w:r>
+      <w:r>
+        <w:rPr>
+          <w:rFonts w:ascii="Times New Roman" w:hAnsi="Times New Roman" w:cs="Times New Roman"/>
+          <w:i/>
+          <w:iCs/>
+          <w:color w:val="FF0000"/>
+          <w:sz w:val="24"/>
+          <w:szCs w:val="24"/>
+        </w:rPr>
+        <w:t>(2 р.)</w:t>
+      </w:r>
+      <w:r>
+        <w:rPr>
+          <w:rFonts w:ascii="Times New Roman" w:hAnsi="Times New Roman" w:cs="Times New Roman"/>
+          <w:i/>
+          <w:iCs/>
+          <w:sz w:val="24"/>
+          <w:szCs w:val="24"/>
+        </w:rPr>
+        <w:t>.</w:t>
+      </w:r>
+    </w:p>
+    <w:p>
+      <w:pPr>
+        <w:spacing w:line="276" w:lineRule="auto"/>
+        <w:jc w:val="both"/>
+        <w:rPr>
+          <w:rFonts w:ascii="Times New Roman" w:hAnsi="Times New Roman" w:cs="Times New Roman"/>
+          <w:sz w:val="24"/>
+          <w:szCs w:val="24"/>
+        </w:rPr>
+      </w:pPr>
+      <w:r>
+        <w:rPr>
+          <w:rFonts w:ascii="Times New Roman" w:hAnsi="Times New Roman" w:cs="Times New Roman"/>
+          <w:sz w:val="24"/>
+          <w:szCs w:val="24"/>
+        </w:rPr>
+        <w:t>Святí слáвні Апостоли, Пророки й Мученики та всі Святí, молíте Бога за нас, грíшних</w:t>
+      </w:r>
+      <w:r>
+        <w:rPr>
+          <w:rFonts w:ascii="Times New Roman" w:hAnsi="Times New Roman" w:cs="Times New Roman"/>
+          <w:i/>
+          <w:iCs/>
+          <w:sz w:val="24"/>
+          <w:szCs w:val="24"/>
+        </w:rPr>
+        <w:t xml:space="preserve"> </w:t>
+      </w:r>
+      <w:r>
+        <w:rPr>
+          <w:rFonts w:ascii="Times New Roman" w:hAnsi="Times New Roman" w:cs="Times New Roman"/>
+          <w:i/>
+          <w:iCs/>
+          <w:color w:val="FF0000"/>
+          <w:sz w:val="24"/>
+          <w:szCs w:val="24"/>
+        </w:rPr>
+        <w:t>(2 р.)</w:t>
+      </w:r>
+      <w:r>
+        <w:rPr>
+          <w:rFonts w:ascii="Times New Roman" w:hAnsi="Times New Roman" w:cs="Times New Roman"/>
+          <w:i/>
+          <w:iCs/>
+          <w:sz w:val="24"/>
+          <w:szCs w:val="24"/>
+        </w:rPr>
+        <w:t>.</w:t>
+      </w:r>
+    </w:p>
+    <w:p>
+      <w:pPr>
+        <w:spacing w:line="276" w:lineRule="auto"/>
+        <w:jc w:val="both"/>
+        <w:rPr>
+          <w:rFonts w:ascii="Times New Roman" w:hAnsi="Times New Roman" w:cs="Times New Roman"/>
+          <w:sz w:val="24"/>
+          <w:szCs w:val="24"/>
+        </w:rPr>
+      </w:pPr>
+      <w:r>
+        <w:rPr>
+          <w:rFonts w:ascii="Times New Roman" w:hAnsi="Times New Roman" w:cs="Times New Roman"/>
+          <w:sz w:val="24"/>
+          <w:szCs w:val="24"/>
+        </w:rPr>
+        <w:t>Преподóбні й богонóсні отцí нáші Антóнію і Теодóсію та íнші чудотвóрці Печéрські, молíть Бóга за нас, грíшних</w:t>
+      </w:r>
+      <w:r>
+        <w:rPr>
+          <w:rFonts w:ascii="Times New Roman" w:hAnsi="Times New Roman" w:cs="Times New Roman"/>
+          <w:i/>
+          <w:iCs/>
+          <w:sz w:val="24"/>
+          <w:szCs w:val="24"/>
+        </w:rPr>
+        <w:t xml:space="preserve"> </w:t>
+      </w:r>
+      <w:r>
+        <w:rPr>
+          <w:rFonts w:ascii="Times New Roman" w:hAnsi="Times New Roman" w:cs="Times New Roman"/>
+          <w:i/>
+          <w:iCs/>
+          <w:color w:val="FF0000"/>
+          <w:sz w:val="24"/>
+          <w:szCs w:val="24"/>
+        </w:rPr>
+        <w:t>(2 р.)</w:t>
+      </w:r>
+      <w:r>
+        <w:rPr>
+          <w:rFonts w:ascii="Times New Roman" w:hAnsi="Times New Roman" w:cs="Times New Roman"/>
+          <w:i/>
+          <w:iCs/>
+          <w:sz w:val="24"/>
+          <w:szCs w:val="24"/>
+        </w:rPr>
+        <w:t>.</w:t>
+      </w:r>
+    </w:p>
+    <w:p>
+      <w:pPr>
+        <w:spacing w:line="276" w:lineRule="auto"/>
+        <w:jc w:val="both"/>
+        <w:rPr>
+          <w:rFonts w:ascii="Times New Roman" w:hAnsi="Times New Roman" w:cs="Times New Roman"/>
+          <w:color w:val="FF0000"/>
+          <w:sz w:val="24"/>
+          <w:szCs w:val="24"/>
+        </w:rPr>
+      </w:pPr>
+      <w:r>
+        <w:rPr>
+          <w:rFonts w:ascii="Times New Roman" w:hAnsi="Times New Roman" w:cs="Times New Roman"/>
+          <w:i/>
+          <w:iCs/>
+          <w:color w:val="FF0000"/>
+          <w:sz w:val="24"/>
+          <w:szCs w:val="24"/>
+        </w:rPr>
+        <w:t>Тут додається стих і святому храму. (2 р.)</w:t>
+      </w:r>
+    </w:p>
+    <w:p>
+      <w:pPr>
+        <w:spacing w:line="276" w:lineRule="auto"/>
+        <w:jc w:val="both"/>
+        <w:rPr>
+          <w:rFonts w:ascii="Times New Roman" w:hAnsi="Times New Roman" w:cs="Times New Roman"/>
+          <w:sz w:val="24"/>
+          <w:szCs w:val="24"/>
+        </w:rPr>
+      </w:pPr>
+      <w:r>
+        <w:rPr>
+          <w:rFonts w:ascii="Times New Roman" w:hAnsi="Times New Roman" w:cs="Times New Roman"/>
+          <w:sz w:val="24"/>
+          <w:szCs w:val="24"/>
+        </w:rPr>
+        <w:t>Неперемо́жна й незла́мна, і боже́ственна си́ло че́сного й животво́рчого Хреста́, не поки́нь нас, грі́шних</w:t>
+      </w:r>
+      <w:r>
+        <w:rPr>
+          <w:rFonts w:ascii="Times New Roman" w:hAnsi="Times New Roman" w:cs="Times New Roman"/>
+          <w:i/>
+          <w:iCs/>
+          <w:sz w:val="24"/>
+          <w:szCs w:val="24"/>
+        </w:rPr>
+        <w:t xml:space="preserve">. </w:t>
+      </w:r>
+      <w:r>
+        <w:rPr>
+          <w:rFonts w:ascii="Times New Roman" w:hAnsi="Times New Roman" w:cs="Times New Roman"/>
+          <w:i/>
+          <w:iCs/>
+          <w:color w:val="FF0000"/>
+          <w:sz w:val="24"/>
+          <w:szCs w:val="24"/>
+        </w:rPr>
+        <w:t>(2 р.)</w:t>
+      </w:r>
+    </w:p>
+    <w:p>
+      <w:pPr>
+        <w:spacing w:line="276" w:lineRule="auto"/>
+        <w:jc w:val="both"/>
+        <w:rPr>
+          <w:rFonts w:ascii="Times New Roman" w:hAnsi="Times New Roman" w:cs="Times New Roman"/>
+          <w:sz w:val="24"/>
+          <w:szCs w:val="24"/>
+        </w:rPr>
+      </w:pPr>
+      <w:r>
+        <w:rPr>
+          <w:rFonts w:ascii="Times New Roman" w:hAnsi="Times New Roman" w:cs="Times New Roman"/>
+          <w:sz w:val="24"/>
+          <w:szCs w:val="24"/>
+        </w:rPr>
+        <w:t>Бóже, будь милости́вий до нас, грі́шних</w:t>
+      </w:r>
+      <w:r>
+        <w:rPr>
+          <w:rFonts w:ascii="Times New Roman" w:hAnsi="Times New Roman" w:cs="Times New Roman"/>
+          <w:i/>
+          <w:iCs/>
+          <w:sz w:val="24"/>
+          <w:szCs w:val="24"/>
+        </w:rPr>
+        <w:t>.</w:t>
+      </w:r>
+      <w:r>
+        <w:rPr>
+          <w:rFonts w:ascii="Times New Roman" w:hAnsi="Times New Roman" w:cs="Times New Roman"/>
+          <w:sz w:val="24"/>
+          <w:szCs w:val="24"/>
+        </w:rPr>
+        <w:t xml:space="preserve"> </w:t>
+      </w:r>
+      <w:r>
+        <w:rPr>
+          <w:rFonts w:ascii="Times New Roman" w:hAnsi="Times New Roman" w:cs="Times New Roman"/>
+          <w:i/>
+          <w:iCs/>
+          <w:color w:val="FF0000"/>
+          <w:sz w:val="24"/>
+          <w:szCs w:val="24"/>
+        </w:rPr>
+        <w:t>(2 р.)</w:t>
+      </w:r>
+    </w:p>
+    <w:p>
+      <w:pPr>
+        <w:spacing w:line="276" w:lineRule="auto"/>
+        <w:jc w:val="both"/>
+        <w:rPr>
+          <w:rFonts w:ascii="Times New Roman" w:hAnsi="Times New Roman" w:cs="Times New Roman"/>
+          <w:sz w:val="24"/>
+          <w:szCs w:val="24"/>
+        </w:rPr>
+      </w:pPr>
+      <w:r>
+        <w:rPr>
+          <w:rFonts w:ascii="Times New Roman" w:hAnsi="Times New Roman" w:cs="Times New Roman"/>
+          <w:sz w:val="24"/>
+          <w:szCs w:val="24"/>
+        </w:rPr>
+        <w:t>Бóже, очи́сти нáші гріхи́ і поми́луй нас</w:t>
+      </w:r>
+      <w:r>
+        <w:rPr>
+          <w:rFonts w:ascii="Times New Roman" w:hAnsi="Times New Roman" w:cs="Times New Roman"/>
+          <w:i/>
+          <w:iCs/>
+          <w:sz w:val="24"/>
+          <w:szCs w:val="24"/>
+        </w:rPr>
+        <w:t xml:space="preserve">. </w:t>
+      </w:r>
+      <w:r>
+        <w:rPr>
+          <w:rFonts w:ascii="Times New Roman" w:hAnsi="Times New Roman" w:cs="Times New Roman"/>
+          <w:i/>
+          <w:iCs/>
+          <w:color w:val="FF0000"/>
+          <w:sz w:val="24"/>
+          <w:szCs w:val="24"/>
+        </w:rPr>
+        <w:t>(2 р.)</w:t>
+      </w:r>
+    </w:p>
+    <w:p>
+      <w:pPr>
+        <w:spacing w:line="276" w:lineRule="auto"/>
+        <w:jc w:val="both"/>
+        <w:rPr>
+          <w:rFonts w:ascii="Times New Roman" w:hAnsi="Times New Roman" w:cs="Times New Roman"/>
+          <w:sz w:val="24"/>
+          <w:szCs w:val="24"/>
+        </w:rPr>
+      </w:pPr>
+    </w:p>
+    <w:p>
+      <w:pPr>
+        <w:spacing w:after="120"/>
+        <w:rPr>
+          <w:lang w:val="ru-MD"/>
+        </w:rPr>
+      </w:pPr>
+      <w:r>
+        <w:rPr>
+          <w:rFonts w:ascii="Times New Roman" w:hAnsi="Times New Roman"/>
+          <w:sz w:val="24"/>
+          <w:lang w:val="ru-MD"/>
+        </w:rPr>
+        <w:t xml:space="preserve">Святи́й Бо́же, святи́й Крі́пкий, святи́й Безсме́ртний, поми́луй нас. </w:t>
+      </w:r>
+      <w:r>
+        <w:rPr>
+          <w:rFonts w:ascii="Times New Roman" w:hAnsi="Times New Roman"/>
+          <w:i/>
+          <w:color w:val="FF0000"/>
+          <w:sz w:val="24"/>
+          <w:lang w:val="ru-MD"/>
         </w:rPr>
         <w:t>(3 р.)</w:t>
       </w:r>
-      <w:r>
-        <w:rPr>
-          <w:rFonts w:ascii="Times New Roman" w:hAnsi="Times New Roman" w:cs="Times New Roman"/>
-          <w:i/>
-          <w:iCs/>
-          <w:sz w:val="24"/>
-          <w:szCs w:val="24"/>
+    </w:p>
+    <w:p>
+      <w:pPr>
+        <w:spacing w:after="120"/>
+        <w:rPr>
+          <w:lang w:val="ru-MD"/>
+        </w:rPr>
+      </w:pPr>
+      <w:r>
+        <w:rPr>
+          <w:rFonts w:ascii="Times New Roman" w:hAnsi="Times New Roman"/>
+          <w:sz w:val="24"/>
+          <w:lang w:val="ru-MD"/>
+        </w:rPr>
+        <w:t>Сла́ва Отцю́, і Си́ну, і Свято́му Ду́хові,* і ни́ні, і повсякча́с, і на ві́ки вікі́в. Амі́нь.</w:t>
+      </w:r>
+    </w:p>
+    <w:p>
+      <w:pPr>
+        <w:spacing w:after="120"/>
+        <w:rPr>
+          <w:lang w:val="ru-MD"/>
+        </w:rPr>
+      </w:pPr>
+      <w:r>
+        <w:rPr>
+          <w:rFonts w:ascii="Times New Roman" w:hAnsi="Times New Roman"/>
+          <w:sz w:val="24"/>
+          <w:lang w:val="ru-MD"/>
+        </w:rPr>
+        <w:t>Пресвята́ Тро́йце, поми́луй нас; Го́споди, очи́сти гріхи́ на́ші; Влади́ко, прости́ беззако́ння на́ші; Святи́й, завіта́й і зціли́ не́мочі на́ші, І́мени Твого́ ра́ди.</w:t>
+      </w:r>
+    </w:p>
+    <w:p>
+      <w:pPr>
+        <w:spacing w:after="120"/>
+        <w:rPr>
+          <w:lang w:val="ru-MD"/>
+        </w:rPr>
+      </w:pPr>
+      <w:r>
+        <w:rPr>
+          <w:rFonts w:ascii="Times New Roman" w:hAnsi="Times New Roman"/>
+          <w:sz w:val="24"/>
+          <w:lang w:val="ru-MD"/>
+        </w:rPr>
+        <w:t xml:space="preserve">Го́споди, поми́луй. </w:t>
+      </w:r>
+      <w:r>
+        <w:rPr>
+          <w:rFonts w:ascii="Times New Roman" w:hAnsi="Times New Roman"/>
+          <w:i/>
+          <w:color w:val="FF0000"/>
+          <w:sz w:val="24"/>
+          <w:lang w:val="ru-MD"/>
+        </w:rPr>
+        <w:t>(3 р.)</w:t>
+      </w:r>
+    </w:p>
+    <w:p>
+      <w:pPr>
+        <w:spacing w:after="120"/>
+        <w:rPr>
+          <w:lang w:val="ru-MD"/>
+        </w:rPr>
+      </w:pPr>
+      <w:r>
+        <w:rPr>
+          <w:rFonts w:ascii="Times New Roman" w:hAnsi="Times New Roman"/>
+          <w:sz w:val="24"/>
+          <w:lang w:val="ru-MD"/>
+        </w:rPr>
+        <w:t>Сла́ва Отцю́, і Си́ну, і Свято́му Ду́хові,* і ни́ні, і повсякча́с, і на ві́ки вікі́в. Амі́нь.</w:t>
+      </w:r>
+    </w:p>
+    <w:p>
+      <w:pPr>
+        <w:spacing w:after="120"/>
+        <w:rPr>
+          <w:lang w:val="ru-MD"/>
+        </w:rPr>
+      </w:pPr>
+      <w:r>
+        <w:rPr>
+          <w:rFonts w:ascii="Times New Roman" w:hAnsi="Times New Roman"/>
+          <w:sz w:val="24"/>
+          <w:lang w:val="ru-MD"/>
+        </w:rPr>
+        <w:t>О́тче наш, що єси́ на небеса́х,* неха́й святи́ться ім’я́ Твоє́,* неха́й при́йде ца́рство Твоє́,* неха́й бу́де во́ля Твоя́, як на не́бі, так і на землі́.* Хліб наш насу́щний дай нам сього́дні;* і прости́ нам прови́ни на́ші,* як і ми проща́ємо винува́тцям на́шим;* і не введи́ нас у споку́су,* але́ ви́зволи нас від лука́вого.</w:t>
+      </w:r>
+    </w:p>
+    <w:p>
+      <w:pPr>
+        <w:spacing w:after="120"/>
+        <w:rPr>
+          <w:lang w:val="ru-MD"/>
+        </w:rPr>
+      </w:pPr>
+      <w:r>
+        <w:rPr>
+          <w:rFonts w:ascii="Times New Roman" w:hAnsi="Times New Roman"/>
+          <w:i/>
+          <w:color w:val="FF0000"/>
+          <w:sz w:val="24"/>
+          <w:lang w:val="ru-MD"/>
+        </w:rPr>
+        <w:t>Священник:</w:t>
+      </w:r>
+      <w:r>
+        <w:rPr>
+          <w:rFonts w:ascii="Times New Roman" w:hAnsi="Times New Roman"/>
+          <w:sz w:val="24"/>
+          <w:lang w:val="ru-MD"/>
+        </w:rPr>
+        <w:t xml:space="preserve"> Бо Твоє є царство, і сила, і слава, Отця, і Сина, і Святого Духа, нині, і повсякчас, і на віки віків.</w:t>
+      </w:r>
+    </w:p>
+    <w:p>
+      <w:pPr>
+        <w:spacing w:line="276" w:lineRule="auto"/>
+        <w:jc w:val="both"/>
+        <w:rPr>
+          <w:rFonts w:ascii="Times New Roman" w:hAnsi="Times New Roman" w:cs="Times New Roman"/>
+          <w:sz w:val="24"/>
+          <w:szCs w:val="24"/>
+        </w:rPr>
+      </w:pPr>
+      <w:r>
+        <w:rPr>
+          <w:rFonts w:ascii="Times New Roman" w:hAnsi="Times New Roman" w:cs="Times New Roman"/>
+          <w:i/>
+          <w:iCs/>
+          <w:color w:val="FF0000"/>
+          <w:sz w:val="24"/>
+          <w:szCs w:val="24"/>
+        </w:rPr>
+        <w:t>Хор:</w:t>
+      </w:r>
+      <w:r>
+        <w:rPr>
+          <w:rFonts w:ascii="Times New Roman" w:hAnsi="Times New Roman" w:cs="Times New Roman"/>
+          <w:sz w:val="24"/>
+          <w:szCs w:val="24"/>
+        </w:rPr>
+        <w:t xml:space="preserve"> Ам</w:t>
+      </w:r>
+      <w:r>
+        <w:rPr>
+          <w:rFonts w:ascii="Times New Roman" w:hAnsi="Times New Roman"/>
+          <w:sz w:val="24"/>
+          <w:lang w:val="ru-MD"/>
+        </w:rPr>
+        <w:t>і́</w:t>
+      </w:r>
+      <w:r>
+        <w:rPr>
+          <w:rFonts w:ascii="Times New Roman" w:hAnsi="Times New Roman" w:cs="Times New Roman"/>
+          <w:sz w:val="24"/>
+          <w:szCs w:val="24"/>
+        </w:rPr>
+        <w:t>нь.</w:t>
+      </w:r>
+    </w:p>
+    <w:p>
+      <w:pPr>
+        <w:spacing w:line="276" w:lineRule="auto"/>
+        <w:jc w:val="both"/>
+        <w:rPr>
+          <w:rFonts w:ascii="Times New Roman" w:hAnsi="Times New Roman" w:cs="Times New Roman"/>
+          <w:i/>
+          <w:iCs/>
+          <w:color w:val="FF0000"/>
+          <w:sz w:val="24"/>
+          <w:szCs w:val="24"/>
+        </w:rPr>
+      </w:pPr>
+      <w:r>
+        <w:rPr>
+          <w:rFonts w:ascii="Times New Roman" w:hAnsi="Times New Roman" w:cs="Times New Roman"/>
+          <w:i/>
+          <w:iCs/>
+          <w:color w:val="FF0000"/>
+          <w:sz w:val="24"/>
+          <w:szCs w:val="24"/>
+        </w:rPr>
+        <w:t>Тоді співаються оці тропарі:</w:t>
+      </w:r>
+    </w:p>
+    <w:p>
+      <w:pPr>
+        <w:spacing w:line="276" w:lineRule="auto"/>
+        <w:jc w:val="both"/>
+        <w:rPr>
+          <w:rFonts w:ascii="Times New Roman" w:hAnsi="Times New Roman" w:cs="Times New Roman"/>
+          <w:color w:val="000000" w:themeColor="text1"/>
+          <w:sz w:val="24"/>
+          <w:szCs w:val="24"/>
+        </w:rPr>
+      </w:pPr>
+      <w:bookmarkStart w:id="3" w:name="_Hlk158712584"/>
+      <w:r>
+        <w:rPr>
+          <w:rFonts w:ascii="Times New Roman" w:hAnsi="Times New Roman" w:cs="Times New Roman"/>
+          <w:i/>
+          <w:iCs/>
+          <w:color w:val="FF0000"/>
+          <w:sz w:val="24"/>
+          <w:szCs w:val="24"/>
+        </w:rPr>
+        <w:t>(г</w:t>
+      </w:r>
+      <w:r>
+        <w:rPr>
+          <w:rFonts w:ascii="Times New Roman" w:hAnsi="Times New Roman" w:cs="Times New Roman"/>
+          <w:i/>
+          <w:iCs/>
+          <w:color w:val="FF0000"/>
+          <w:sz w:val="24"/>
+          <w:szCs w:val="24"/>
+          <w:lang w:val="ru-MD"/>
         </w:rPr>
         <w:t>.</w:t>
       </w:r>
-    </w:p>
-    <w:p>
-      <w:pPr>
-        <w:spacing w:line="276" w:lineRule="auto"/>
-        <w:jc w:val="both"/>
-        <w:rPr>
-          <w:rFonts w:ascii="Times New Roman" w:hAnsi="Times New Roman" w:cs="Times New Roman"/>
-          <w:sz w:val="24"/>
-          <w:szCs w:val="24"/>
-        </w:rPr>
-      </w:pPr>
-      <w:r>
-        <w:rPr>
-          <w:rFonts w:ascii="Times New Roman" w:hAnsi="Times New Roman" w:cs="Times New Roman"/>
-          <w:sz w:val="24"/>
-          <w:szCs w:val="24"/>
-        </w:rPr>
-        <w:t>Усí небесні сили святих Ангелів і Архангелів, молíте Бога за нас, грішних</w:t>
-      </w:r>
-      <w:r>
-        <w:rPr>
-          <w:rFonts w:ascii="Times New Roman" w:hAnsi="Times New Roman" w:cs="Times New Roman"/>
-          <w:i/>
-          <w:iCs/>
+      <w:r>
+        <w:rPr>
+          <w:rFonts w:ascii="Times New Roman" w:hAnsi="Times New Roman" w:cs="Times New Roman"/>
+          <w:i/>
+          <w:iCs/>
+          <w:color w:val="FF0000"/>
+          <w:sz w:val="24"/>
+          <w:szCs w:val="24"/>
+        </w:rPr>
+        <w:t xml:space="preserve"> 8):</w:t>
+      </w:r>
+      <w:r>
+        <w:rPr>
+          <w:rFonts w:ascii="Times New Roman" w:hAnsi="Times New Roman" w:cs="Times New Roman"/>
+          <w:color w:val="000000" w:themeColor="text1"/>
           <w:sz w:val="24"/>
           <w:szCs w:val="24"/>
         </w:rPr>
@@ -8910,611 +9328,33 @@
       <w:r>
         <w:rPr>
           <w:rFonts w:ascii="Times New Roman" w:hAnsi="Times New Roman" w:cs="Times New Roman"/>
-          <w:i/>
-          <w:iCs/>
-          <w:color w:val="FF0000"/>
-          <w:sz w:val="24"/>
-          <w:szCs w:val="24"/>
-        </w:rPr>
-        <w:t>(2 р.)</w:t>
-      </w:r>
-      <w:r>
-        <w:rPr>
-          <w:rFonts w:ascii="Times New Roman" w:hAnsi="Times New Roman" w:cs="Times New Roman"/>
-          <w:i/>
-          <w:iCs/>
-          <w:sz w:val="24"/>
-          <w:szCs w:val="24"/>
-        </w:rPr>
-        <w:t>.</w:t>
-      </w:r>
-    </w:p>
-    <w:p>
-      <w:pPr>
-        <w:spacing w:line="276" w:lineRule="auto"/>
-        <w:jc w:val="both"/>
-        <w:rPr>
-          <w:rFonts w:ascii="Times New Roman" w:hAnsi="Times New Roman" w:cs="Times New Roman"/>
-          <w:sz w:val="24"/>
-          <w:szCs w:val="24"/>
-        </w:rPr>
-      </w:pPr>
-      <w:r>
-        <w:rPr>
-          <w:rFonts w:ascii="Times New Roman" w:hAnsi="Times New Roman" w:cs="Times New Roman"/>
-          <w:sz w:val="24"/>
-          <w:szCs w:val="24"/>
-        </w:rPr>
-        <w:t>Святий Іване, пророче і предтéче, і хрестителю Господа нáшого Ісýса Христá, моли Бога за нас, грíшних</w:t>
-      </w:r>
-      <w:r>
-        <w:rPr>
-          <w:rFonts w:ascii="Times New Roman" w:hAnsi="Times New Roman" w:cs="Times New Roman"/>
-          <w:i/>
-          <w:iCs/>
-          <w:sz w:val="24"/>
-          <w:szCs w:val="24"/>
-        </w:rPr>
-        <w:t xml:space="preserve"> </w:t>
-      </w:r>
-      <w:r>
-        <w:rPr>
-          <w:rFonts w:ascii="Times New Roman" w:hAnsi="Times New Roman" w:cs="Times New Roman"/>
-          <w:i/>
-          <w:iCs/>
-          <w:color w:val="FF0000"/>
-          <w:sz w:val="24"/>
-          <w:szCs w:val="24"/>
-        </w:rPr>
-        <w:t>(2 р.)</w:t>
-      </w:r>
-      <w:r>
-        <w:rPr>
-          <w:rFonts w:ascii="Times New Roman" w:hAnsi="Times New Roman" w:cs="Times New Roman"/>
-          <w:i/>
-          <w:iCs/>
-          <w:sz w:val="24"/>
-          <w:szCs w:val="24"/>
-        </w:rPr>
-        <w:t>.</w:t>
-      </w:r>
-    </w:p>
-    <w:p>
-      <w:pPr>
-        <w:spacing w:line="276" w:lineRule="auto"/>
-        <w:jc w:val="both"/>
-        <w:rPr>
-          <w:rFonts w:ascii="Times New Roman" w:hAnsi="Times New Roman" w:cs="Times New Roman"/>
-          <w:sz w:val="24"/>
-          <w:szCs w:val="24"/>
-        </w:rPr>
-      </w:pPr>
-      <w:r>
-        <w:rPr>
-          <w:rFonts w:ascii="Times New Roman" w:hAnsi="Times New Roman" w:cs="Times New Roman"/>
-          <w:sz w:val="24"/>
-          <w:szCs w:val="24"/>
-        </w:rPr>
-        <w:t>Святí слáвні Апостоли, Пророки й Мученики та всі Святí, молíте Бога за нас, грíшних</w:t>
-      </w:r>
-      <w:r>
-        <w:rPr>
-          <w:rFonts w:ascii="Times New Roman" w:hAnsi="Times New Roman" w:cs="Times New Roman"/>
-          <w:i/>
-          <w:iCs/>
-          <w:sz w:val="24"/>
-          <w:szCs w:val="24"/>
-        </w:rPr>
-        <w:t xml:space="preserve"> </w:t>
-      </w:r>
-      <w:r>
-        <w:rPr>
-          <w:rFonts w:ascii="Times New Roman" w:hAnsi="Times New Roman" w:cs="Times New Roman"/>
-          <w:i/>
-          <w:iCs/>
-          <w:color w:val="FF0000"/>
-          <w:sz w:val="24"/>
-          <w:szCs w:val="24"/>
-        </w:rPr>
-        <w:t>(2 р.)</w:t>
-      </w:r>
-      <w:r>
-        <w:rPr>
-          <w:rFonts w:ascii="Times New Roman" w:hAnsi="Times New Roman" w:cs="Times New Roman"/>
-          <w:i/>
-          <w:iCs/>
-          <w:sz w:val="24"/>
-          <w:szCs w:val="24"/>
-        </w:rPr>
-        <w:t>.</w:t>
-      </w:r>
-    </w:p>
-    <w:p>
-      <w:pPr>
-        <w:spacing w:line="276" w:lineRule="auto"/>
-        <w:jc w:val="both"/>
-        <w:rPr>
-          <w:rFonts w:ascii="Times New Roman" w:hAnsi="Times New Roman" w:cs="Times New Roman"/>
-          <w:sz w:val="24"/>
-          <w:szCs w:val="24"/>
-        </w:rPr>
-      </w:pPr>
-      <w:r>
-        <w:rPr>
-          <w:rFonts w:ascii="Times New Roman" w:hAnsi="Times New Roman" w:cs="Times New Roman"/>
-          <w:sz w:val="24"/>
-          <w:szCs w:val="24"/>
-        </w:rPr>
-        <w:t>Преподóбні й богонóсні отцí нáші Антóнію і Теодóсію та íнші чудотвóрці Печéрські, молíть Бóга за нас, грíшних</w:t>
-      </w:r>
-      <w:r>
-        <w:rPr>
-          <w:rFonts w:ascii="Times New Roman" w:hAnsi="Times New Roman" w:cs="Times New Roman"/>
-          <w:i/>
-          <w:iCs/>
-          <w:sz w:val="24"/>
-          <w:szCs w:val="24"/>
-        </w:rPr>
-        <w:t xml:space="preserve"> </w:t>
-      </w:r>
-      <w:r>
-        <w:rPr>
-          <w:rFonts w:ascii="Times New Roman" w:hAnsi="Times New Roman" w:cs="Times New Roman"/>
-          <w:i/>
-          <w:iCs/>
-          <w:color w:val="FF0000"/>
-          <w:sz w:val="24"/>
-          <w:szCs w:val="24"/>
-        </w:rPr>
-        <w:t>(2 р.)</w:t>
-      </w:r>
-      <w:r>
-        <w:rPr>
-          <w:rFonts w:ascii="Times New Roman" w:hAnsi="Times New Roman" w:cs="Times New Roman"/>
-          <w:i/>
-          <w:iCs/>
-          <w:sz w:val="24"/>
-          <w:szCs w:val="24"/>
-        </w:rPr>
-        <w:t>.</w:t>
-      </w:r>
-    </w:p>
-    <w:p>
-      <w:pPr>
-        <w:spacing w:line="276" w:lineRule="auto"/>
-        <w:jc w:val="both"/>
-        <w:rPr>
-          <w:rFonts w:ascii="Times New Roman" w:hAnsi="Times New Roman" w:cs="Times New Roman"/>
-          <w:color w:val="FF0000"/>
-          <w:sz w:val="24"/>
-          <w:szCs w:val="24"/>
-        </w:rPr>
-      </w:pPr>
-      <w:r>
-        <w:rPr>
-          <w:rFonts w:ascii="Times New Roman" w:hAnsi="Times New Roman" w:cs="Times New Roman"/>
-          <w:i/>
-          <w:iCs/>
-          <w:color w:val="FF0000"/>
-          <w:sz w:val="24"/>
-          <w:szCs w:val="24"/>
-        </w:rPr>
-        <w:t>Тут додається стих і святому храму (2).</w:t>
-      </w:r>
-    </w:p>
-    <w:p>
-      <w:pPr>
-        <w:spacing w:line="276" w:lineRule="auto"/>
-        <w:jc w:val="both"/>
-        <w:rPr>
-          <w:rFonts w:ascii="Times New Roman" w:hAnsi="Times New Roman" w:cs="Times New Roman"/>
-          <w:sz w:val="24"/>
-          <w:szCs w:val="24"/>
-        </w:rPr>
-      </w:pPr>
-      <w:r>
-        <w:rPr>
-          <w:rFonts w:ascii="Times New Roman" w:hAnsi="Times New Roman" w:cs="Times New Roman"/>
-          <w:sz w:val="24"/>
-          <w:szCs w:val="24"/>
-        </w:rPr>
-        <w:t>Непереможна й незламна, і божественна сило чесного й животворящого Хреста, не покинь нас, грíшних</w:t>
-      </w:r>
-      <w:r>
-        <w:rPr>
-          <w:rFonts w:ascii="Times New Roman" w:hAnsi="Times New Roman" w:cs="Times New Roman"/>
-          <w:i/>
-          <w:iCs/>
-          <w:sz w:val="24"/>
-          <w:szCs w:val="24"/>
-        </w:rPr>
-        <w:t xml:space="preserve"> (2).</w:t>
-      </w:r>
-    </w:p>
-    <w:p>
-      <w:pPr>
-        <w:spacing w:line="276" w:lineRule="auto"/>
-        <w:jc w:val="both"/>
-        <w:rPr>
-          <w:rFonts w:ascii="Times New Roman" w:hAnsi="Times New Roman" w:cs="Times New Roman"/>
-          <w:sz w:val="24"/>
-          <w:szCs w:val="24"/>
-        </w:rPr>
-      </w:pPr>
-      <w:r>
-        <w:rPr>
-          <w:rFonts w:ascii="Times New Roman" w:hAnsi="Times New Roman" w:cs="Times New Roman"/>
-          <w:sz w:val="24"/>
-          <w:szCs w:val="24"/>
-        </w:rPr>
-        <w:t xml:space="preserve">Бóже, милостивий будь нам, грíшним </w:t>
-      </w:r>
-      <w:r>
-        <w:rPr>
-          <w:rFonts w:ascii="Times New Roman" w:hAnsi="Times New Roman" w:cs="Times New Roman"/>
-          <w:i/>
-          <w:iCs/>
-          <w:color w:val="FF0000"/>
-          <w:sz w:val="24"/>
-          <w:szCs w:val="24"/>
-        </w:rPr>
-        <w:t>(2 р.)</w:t>
-      </w:r>
-      <w:r>
-        <w:rPr>
-          <w:rFonts w:ascii="Times New Roman" w:hAnsi="Times New Roman" w:cs="Times New Roman"/>
-          <w:i/>
-          <w:iCs/>
-          <w:sz w:val="24"/>
-          <w:szCs w:val="24"/>
-        </w:rPr>
-        <w:t>.</w:t>
-      </w:r>
-    </w:p>
-    <w:p>
-      <w:pPr>
-        <w:spacing w:line="276" w:lineRule="auto"/>
-        <w:jc w:val="both"/>
-        <w:rPr>
-          <w:rFonts w:ascii="Times New Roman" w:hAnsi="Times New Roman" w:cs="Times New Roman"/>
-          <w:sz w:val="24"/>
-          <w:szCs w:val="24"/>
-        </w:rPr>
-      </w:pPr>
-      <w:r>
-        <w:rPr>
-          <w:rFonts w:ascii="Times New Roman" w:hAnsi="Times New Roman" w:cs="Times New Roman"/>
-          <w:sz w:val="24"/>
-          <w:szCs w:val="24"/>
-        </w:rPr>
-        <w:t>Бóже, очисти гріхи нáші і помилуй нас</w:t>
-      </w:r>
-      <w:r>
-        <w:rPr>
-          <w:rFonts w:ascii="Times New Roman" w:hAnsi="Times New Roman" w:cs="Times New Roman"/>
-          <w:i/>
-          <w:iCs/>
-          <w:sz w:val="24"/>
-          <w:szCs w:val="24"/>
-        </w:rPr>
-        <w:t xml:space="preserve"> </w:t>
-      </w:r>
-      <w:r>
-        <w:rPr>
-          <w:rFonts w:ascii="Times New Roman" w:hAnsi="Times New Roman" w:cs="Times New Roman"/>
-          <w:i/>
-          <w:iCs/>
-          <w:color w:val="FF0000"/>
-          <w:sz w:val="24"/>
-          <w:szCs w:val="24"/>
-        </w:rPr>
-        <w:t>(2 р.)</w:t>
-      </w:r>
-      <w:r>
-        <w:rPr>
-          <w:rFonts w:ascii="Times New Roman" w:hAnsi="Times New Roman" w:cs="Times New Roman"/>
-          <w:i/>
-          <w:iCs/>
-          <w:sz w:val="24"/>
-          <w:szCs w:val="24"/>
-        </w:rPr>
-        <w:t>.</w:t>
-      </w:r>
-    </w:p>
-    <w:p>
-      <w:pPr>
-        <w:spacing w:line="276" w:lineRule="auto"/>
-        <w:jc w:val="both"/>
-        <w:rPr>
-          <w:rFonts w:ascii="Times New Roman" w:hAnsi="Times New Roman" w:cs="Times New Roman"/>
-          <w:sz w:val="24"/>
-          <w:szCs w:val="24"/>
-        </w:rPr>
-      </w:pPr>
-    </w:p>
-    <w:p>
-      <w:pPr>
-        <w:spacing w:after="120"/>
-        <w:jc w:val="both"/>
-      </w:pPr>
-      <w:r>
-        <w:rPr>
-          <w:rFonts w:ascii="Times New Roman" w:hAnsi="Times New Roman"/>
-          <w:sz w:val="24"/>
-        </w:rPr>
-        <w:t xml:space="preserve">Святий Боже, святий Кріпкий, святий Безсмертний, помилуй нас. </w:t>
-      </w:r>
-      <w:r>
-        <w:rPr>
-          <w:rFonts w:ascii="Times New Roman" w:hAnsi="Times New Roman"/>
-          <w:i/>
-          <w:color w:val="FF0000"/>
-          <w:sz w:val="24"/>
-        </w:rPr>
-        <w:t>(3 р.)</w:t>
-      </w:r>
-    </w:p>
-    <w:p>
-      <w:pPr>
-        <w:spacing w:line="276" w:lineRule="auto"/>
-        <w:jc w:val="both"/>
-        <w:rPr>
-          <w:rFonts w:ascii="Times New Roman" w:hAnsi="Times New Roman" w:cs="Times New Roman"/>
-          <w:sz w:val="24"/>
-          <w:szCs w:val="24"/>
-        </w:rPr>
-      </w:pPr>
-      <w:r>
-        <w:rPr>
-          <w:rFonts w:ascii="Times New Roman" w:hAnsi="Times New Roman" w:cs="Times New Roman"/>
-          <w:sz w:val="24"/>
-          <w:szCs w:val="24"/>
-        </w:rPr>
-        <w:t>Слава Отцю, і Сину, і Святому Духові, і нині, і повсякчас, і на віки віків. Амінь.</w:t>
-      </w:r>
-    </w:p>
-    <w:p>
-      <w:pPr>
-        <w:spacing w:line="276" w:lineRule="auto"/>
-        <w:jc w:val="both"/>
-        <w:rPr>
-          <w:rFonts w:ascii="Times New Roman" w:hAnsi="Times New Roman" w:cs="Times New Roman"/>
-          <w:sz w:val="24"/>
-          <w:szCs w:val="24"/>
-        </w:rPr>
-      </w:pPr>
-      <w:r>
-        <w:rPr>
-          <w:rFonts w:ascii="Times New Roman" w:hAnsi="Times New Roman" w:cs="Times New Roman"/>
-          <w:sz w:val="24"/>
-          <w:szCs w:val="24"/>
-        </w:rPr>
-        <w:t>Пресвята Тройце, помилуй нас; Господи, очисти гріхи наші; Владико, прости беззаконня наші; Святий, посіти і зціли немочі наші імени твого ради.</w:t>
-      </w:r>
-    </w:p>
-    <w:p>
-      <w:pPr>
-        <w:spacing w:after="120"/>
-        <w:jc w:val="both"/>
-      </w:pPr>
-      <w:r>
-        <w:rPr>
-          <w:rFonts w:ascii="Times New Roman" w:hAnsi="Times New Roman"/>
-          <w:sz w:val="24"/>
-        </w:rPr>
-        <w:t xml:space="preserve">Господи, помилуй. </w:t>
-      </w:r>
-      <w:r>
-        <w:rPr>
-          <w:rFonts w:ascii="Times New Roman" w:hAnsi="Times New Roman"/>
-          <w:i/>
-          <w:color w:val="FF0000"/>
-          <w:sz w:val="24"/>
-        </w:rPr>
-        <w:t>(3 р.)</w:t>
-      </w:r>
-    </w:p>
-    <w:p>
-      <w:pPr>
-        <w:spacing w:line="276" w:lineRule="auto"/>
-        <w:jc w:val="both"/>
-        <w:rPr>
-          <w:rFonts w:ascii="Times New Roman" w:hAnsi="Times New Roman" w:cs="Times New Roman"/>
-          <w:sz w:val="24"/>
-          <w:szCs w:val="24"/>
-        </w:rPr>
-      </w:pPr>
-      <w:r>
-        <w:rPr>
-          <w:rFonts w:ascii="Times New Roman" w:hAnsi="Times New Roman" w:cs="Times New Roman"/>
-          <w:sz w:val="24"/>
-          <w:szCs w:val="24"/>
-        </w:rPr>
-        <w:t>Слава Отцю, і Сину, і Святому Духові, і нині, і повсякчас, і на віки віків. Амінь.</w:t>
-      </w:r>
-    </w:p>
-    <w:p>
-      <w:pPr>
-        <w:spacing w:line="276" w:lineRule="auto"/>
-        <w:jc w:val="both"/>
-        <w:rPr>
-          <w:rFonts w:ascii="Times New Roman" w:hAnsi="Times New Roman" w:cs="Times New Roman"/>
-          <w:sz w:val="24"/>
-          <w:szCs w:val="24"/>
-        </w:rPr>
-      </w:pPr>
-      <w:r>
-        <w:rPr>
-          <w:rFonts w:ascii="Times New Roman" w:hAnsi="Times New Roman" w:cs="Times New Roman"/>
-          <w:sz w:val="24"/>
-          <w:szCs w:val="24"/>
-        </w:rPr>
-        <w:t>Отче наш, що єси на небесах, нехай святиться ім’я Твоє, нехай прийде царство Твоє, нехай буде воля твоя, як на небі, так і на землі. Хліб наш насущний дай нам сьогодні; і прости нам провини наші, як і ми прощаємо винуватцям нашим; і не введи нас у спокусу, але визволи нас від лукавого.</w:t>
-      </w:r>
-    </w:p>
-    <w:p>
-      <w:pPr>
-        <w:spacing w:after="120"/>
-        <w:jc w:val="both"/>
-      </w:pPr>
-      <w:r>
-        <w:rPr>
-          <w:rFonts w:ascii="Times New Roman" w:hAnsi="Times New Roman"/>
-          <w:i/>
-          <w:color w:val="FF0000"/>
-          <w:sz w:val="24"/>
-        </w:rPr>
-        <w:t>Священник:</w:t>
-      </w:r>
-      <w:r>
-        <w:rPr>
-          <w:rFonts w:ascii="Times New Roman" w:hAnsi="Times New Roman"/>
-          <w:sz w:val="24"/>
-        </w:rPr>
-        <w:t xml:space="preserve"> Бо Твоє є царство, і сила, і слава, Отця, і Сина, і Святого Духа, нині, і повсякчас, і на віки віків.</w:t>
-      </w:r>
-    </w:p>
-    <w:p>
-      <w:pPr>
-        <w:spacing w:line="276" w:lineRule="auto"/>
-        <w:jc w:val="both"/>
-        <w:rPr>
-          <w:rFonts w:ascii="Times New Roman" w:hAnsi="Times New Roman" w:cs="Times New Roman"/>
-          <w:sz w:val="24"/>
-          <w:szCs w:val="24"/>
-        </w:rPr>
-      </w:pPr>
-      <w:r>
-        <w:rPr>
-          <w:rFonts w:ascii="Times New Roman" w:hAnsi="Times New Roman" w:cs="Times New Roman"/>
-          <w:i/>
-          <w:iCs/>
-          <w:color w:val="FF0000"/>
-          <w:sz w:val="24"/>
-          <w:szCs w:val="24"/>
-        </w:rPr>
-        <w:t>Хор:</w:t>
-      </w:r>
-      <w:r>
-        <w:rPr>
-          <w:rFonts w:ascii="Times New Roman" w:hAnsi="Times New Roman" w:cs="Times New Roman"/>
-          <w:sz w:val="24"/>
-          <w:szCs w:val="24"/>
-        </w:rPr>
-        <w:t xml:space="preserve"> Амінь.</w:t>
-      </w:r>
-    </w:p>
-    <w:p>
-      <w:pPr>
-        <w:spacing w:line="276" w:lineRule="auto"/>
-        <w:jc w:val="both"/>
-        <w:rPr>
-          <w:rFonts w:ascii="Times New Roman" w:hAnsi="Times New Roman" w:cs="Times New Roman"/>
-          <w:i/>
-          <w:iCs/>
-          <w:color w:val="FF0000"/>
-          <w:sz w:val="24"/>
-          <w:szCs w:val="24"/>
-        </w:rPr>
-      </w:pPr>
-      <w:r>
-        <w:rPr>
-          <w:rFonts w:ascii="Times New Roman" w:hAnsi="Times New Roman" w:cs="Times New Roman"/>
-          <w:i/>
-          <w:iCs/>
-          <w:color w:val="FF0000"/>
-          <w:sz w:val="24"/>
-          <w:szCs w:val="24"/>
-        </w:rPr>
-        <w:t>Тоді співаються оці тропарі:</w:t>
-      </w:r>
-    </w:p>
-    <w:p>
-      <w:pPr>
-        <w:spacing w:line="276" w:lineRule="auto"/>
-        <w:jc w:val="both"/>
-        <w:rPr>
-          <w:rFonts w:ascii="Times New Roman" w:hAnsi="Times New Roman" w:cs="Times New Roman"/>
           <w:color w:val="000000" w:themeColor="text1"/>
           <w:sz w:val="24"/>
           <w:szCs w:val="24"/>
         </w:rPr>
-      </w:pPr>
-      <w:bookmarkStart w:id="4" w:name="_Hlk158712584"/>
-      <w:r>
-        <w:rPr>
-          <w:rFonts w:ascii="Times New Roman" w:hAnsi="Times New Roman" w:cs="Times New Roman"/>
-          <w:i/>
-          <w:iCs/>
-          <w:color w:val="FF0000"/>
-          <w:sz w:val="24"/>
-          <w:szCs w:val="24"/>
-        </w:rPr>
-        <w:t>(г</w:t>
-      </w:r>
-      <w:r>
-        <w:rPr>
-          <w:rFonts w:ascii="Times New Roman" w:hAnsi="Times New Roman" w:cs="Times New Roman"/>
-          <w:i/>
-          <w:iCs/>
-          <w:color w:val="FF0000"/>
-          <w:sz w:val="24"/>
-          <w:szCs w:val="24"/>
-          <w:lang w:val="ru-MD"/>
-        </w:rPr>
-        <w:t>.</w:t>
-      </w:r>
-      <w:r>
-        <w:rPr>
-          <w:rFonts w:ascii="Times New Roman" w:hAnsi="Times New Roman" w:cs="Times New Roman"/>
-          <w:i/>
-          <w:iCs/>
-          <w:color w:val="FF0000"/>
-          <w:sz w:val="24"/>
-          <w:szCs w:val="24"/>
-        </w:rPr>
-        <w:t xml:space="preserve"> 8):</w:t>
-      </w:r>
-      <w:r>
+        <w:t>Невсипущість невидимих ворогів моїх ти знаєш, Господи;* i окаянного тіла мого неміч пізнав ти, Творче мій.* Тому в руки твої віддаю дух мій.* Покрий мене покровом твоєї благодаті, щоб не заснути мені смертю.* I просвіти духовні очі мої для насолоди божественними словами твоїми.* I, як єдиний благий i людинолюбний,* збуди мене в час пригожий, щоб славословити тебе.</w:t>
+      </w:r>
+    </w:p>
+    <w:p>
+      <w:pPr>
+        <w:spacing w:line="276" w:lineRule="auto"/>
+        <w:jc w:val="both"/>
         <w:rPr>
           <w:rFonts w:ascii="Times New Roman" w:hAnsi="Times New Roman" w:cs="Times New Roman"/>
           <w:color w:val="000000" w:themeColor="text1"/>
           <w:sz w:val="24"/>
           <w:szCs w:val="24"/>
         </w:rPr>
-        <w:t xml:space="preserve"> </w:t>
-      </w:r>
-      <w:r>
-        <w:rPr>
-          <w:rFonts w:ascii="Times New Roman" w:hAnsi="Times New Roman" w:cs="Times New Roman"/>
-          <w:color w:val="000000" w:themeColor="text1"/>
-          <w:sz w:val="24"/>
-          <w:szCs w:val="24"/>
-        </w:rPr>
-        <w:t>Невсипущість невидимих ворогів моїх ти знаєш, Господи;* i окаянного тіла мого неміч пізнав ти, Творче мій.* Тому в руки твої віддаю дух мій.* Покрий мене покровом твоєї благодаті, щоб не заснути мені смертю.* I просвіти духовні очі мої для насолоди божественними словами твоїми.* I, як єдиний благий i людинолюбний,* збуди мене в час пригожий, щоб славословити тебе.</w:t>
-      </w:r>
-    </w:p>
-    <w:p>
-      <w:pPr>
-        <w:spacing w:line="276" w:lineRule="auto"/>
-        <w:jc w:val="both"/>
-        <w:rPr>
-          <w:rFonts w:ascii="Times New Roman" w:hAnsi="Times New Roman" w:cs="Times New Roman"/>
-          <w:color w:val="000000" w:themeColor="text1"/>
-          <w:sz w:val="24"/>
-          <w:szCs w:val="24"/>
-        </w:rPr>
-      </w:pPr>
-      <w:r>
-        <w:rPr>
-          <w:rFonts w:ascii="Times New Roman" w:hAnsi="Times New Roman" w:cs="Times New Roman"/>
-          <w:i/>
-          <w:iCs/>
-          <w:color w:val="FF0000"/>
-          <w:sz w:val="24"/>
-          <w:szCs w:val="24"/>
-        </w:rPr>
-        <w:lastRenderedPageBreak/>
+      </w:pPr>
+      <w:r>
+        <w:rPr>
+          <w:rFonts w:ascii="Times New Roman" w:hAnsi="Times New Roman" w:cs="Times New Roman"/>
+          <w:i/>
+          <w:iCs/>
+          <w:color w:val="FF0000"/>
+          <w:sz w:val="24"/>
+          <w:szCs w:val="24"/>
+        </w:rPr>
         <w:t>Стих:</w:t>
       </w:r>
       <w:r>
@@ -9599,7 +9439,17 @@
           <w:sz w:val="24"/>
           <w:szCs w:val="24"/>
         </w:rPr>
-        <w:t>Сльози дай мені, Боже, як колись жінці грішниці,* i сподоби мене обмити твої ноги,* які визволили мене від обманного шляху,* i приносити тобі, як запашне миро,* життя чисте, проведене у покаянні,* щоб i мені почути жаданий твій голос:* Віра твоя спасла тебе, іди в мирі.</w:t>
+        <w:t xml:space="preserve">Сльози дай мені, Боже, як колись жінці грішниці,* i сподоби мене обмити твої ноги,* які визволили мене від обманного шляху,* i приносити тобі, як запашне миро,* життя чисте, </w:t>
+      </w:r>
+      <w:r>
+        <w:rPr>
+          <w:rFonts w:ascii="Times New Roman" w:hAnsi="Times New Roman" w:cs="Times New Roman"/>
+          <w:color w:val="000000" w:themeColor="text1"/>
+          <w:sz w:val="24"/>
+          <w:szCs w:val="24"/>
+        </w:rPr>
+        <w:lastRenderedPageBreak/>
+        <w:t>проведене у покаянні,* щоб i мені почути жаданий твій голос:* Віра твоя спасла тебе, іди в мирі.</w:t>
       </w:r>
     </w:p>
     <w:p>
@@ -9634,7 +9484,7 @@
         <w:t>На тебе, Богородице, бездоганну надію маючи, спасуся.* Твоє, Пречиста, заступництво мавши, не настрахаюся,* Пожену ворогів моїх i переможу їх,* зодягнувшись, наче в зброю, в єдиний покров твій.* I, благаючи твоєї всемогутньої помочі, взиватиму до тебе:* Владичице, спаси мене молитвами твоїми i силою Сина Божого,* що від тебе тіло прийняв,* виведи мене від темного сну, щоб славословити тебе.</w:t>
       </w:r>
     </w:p>
-    <w:bookmarkEnd w:id="4"/>
+    <w:bookmarkEnd w:id="3"/>
     <w:p>
       <w:pPr>
         <w:spacing w:line="276" w:lineRule="auto"/>
@@ -10024,83 +9874,83 @@
           <w:sz w:val="24"/>
           <w:szCs w:val="24"/>
         </w:rPr>
+        <w:t>Псалом 50</w:t>
+      </w:r>
+    </w:p>
+    <w:p>
+      <w:pPr>
+        <w:spacing w:line="276" w:lineRule="auto"/>
+        <w:jc w:val="both"/>
+        <w:rPr>
+          <w:rFonts w:ascii="Times New Roman" w:hAnsi="Times New Roman" w:cs="Times New Roman"/>
+          <w:sz w:val="24"/>
+          <w:szCs w:val="24"/>
+        </w:rPr>
+      </w:pPr>
+      <w:r>
+        <w:rPr>
+          <w:rFonts w:ascii="Times New Roman" w:hAnsi="Times New Roman" w:cs="Times New Roman"/>
+          <w:sz w:val="24"/>
+          <w:szCs w:val="24"/>
+        </w:rPr>
+        <w:t>Помилуй мене, Боже, по великій милості Твоїй,* і багатством щедрот Твоїх очисти беззаконня моє.</w:t>
+      </w:r>
+    </w:p>
+    <w:p>
+      <w:pPr>
+        <w:spacing w:line="276" w:lineRule="auto"/>
+        <w:jc w:val="both"/>
+        <w:rPr>
+          <w:rFonts w:ascii="Times New Roman" w:hAnsi="Times New Roman" w:cs="Times New Roman"/>
+          <w:sz w:val="24"/>
+          <w:szCs w:val="24"/>
+        </w:rPr>
+      </w:pPr>
+      <w:r>
+        <w:rPr>
+          <w:rFonts w:ascii="Times New Roman" w:hAnsi="Times New Roman" w:cs="Times New Roman"/>
+          <w:sz w:val="24"/>
+          <w:szCs w:val="24"/>
+        </w:rPr>
+        <w:t>Обмий мене повнотою з беззаконня мого* і від гріха мого очисти мене.</w:t>
+      </w:r>
+    </w:p>
+    <w:p>
+      <w:pPr>
+        <w:spacing w:line="276" w:lineRule="auto"/>
+        <w:jc w:val="both"/>
+        <w:rPr>
+          <w:rFonts w:ascii="Times New Roman" w:hAnsi="Times New Roman" w:cs="Times New Roman"/>
+          <w:sz w:val="24"/>
+          <w:szCs w:val="24"/>
+        </w:rPr>
+      </w:pPr>
+      <w:r>
+        <w:rPr>
+          <w:rFonts w:ascii="Times New Roman" w:hAnsi="Times New Roman" w:cs="Times New Roman"/>
+          <w:sz w:val="24"/>
+          <w:szCs w:val="24"/>
+        </w:rPr>
+        <w:t>Бо беззаконня моє я знаю* і гріх мій є завжди передо мною.</w:t>
+      </w:r>
+    </w:p>
+    <w:p>
+      <w:pPr>
+        <w:spacing w:line="276" w:lineRule="auto"/>
+        <w:jc w:val="both"/>
+        <w:rPr>
+          <w:rFonts w:ascii="Times New Roman" w:hAnsi="Times New Roman" w:cs="Times New Roman"/>
+          <w:sz w:val="24"/>
+          <w:szCs w:val="24"/>
+        </w:rPr>
+      </w:pPr>
+      <w:r>
+        <w:rPr>
+          <w:rFonts w:ascii="Times New Roman" w:hAnsi="Times New Roman" w:cs="Times New Roman"/>
+          <w:sz w:val="24"/>
+          <w:szCs w:val="24"/>
+        </w:rPr>
         <w:lastRenderedPageBreak/>
-        <w:t>Псалом 50</w:t>
-      </w:r>
-    </w:p>
-    <w:p>
-      <w:pPr>
-        <w:spacing w:line="276" w:lineRule="auto"/>
-        <w:jc w:val="both"/>
-        <w:rPr>
-          <w:rFonts w:ascii="Times New Roman" w:hAnsi="Times New Roman" w:cs="Times New Roman"/>
-          <w:sz w:val="24"/>
-          <w:szCs w:val="24"/>
-        </w:rPr>
-      </w:pPr>
-      <w:r>
-        <w:rPr>
-          <w:rFonts w:ascii="Times New Roman" w:hAnsi="Times New Roman" w:cs="Times New Roman"/>
-          <w:sz w:val="24"/>
-          <w:szCs w:val="24"/>
-        </w:rPr>
-        <w:t>Помилуй мене, Боже, по великій милості Твоїй,* і багатством щедрот Твоїх очисти беззаконня моє.</w:t>
-      </w:r>
-    </w:p>
-    <w:p>
-      <w:pPr>
-        <w:spacing w:line="276" w:lineRule="auto"/>
-        <w:jc w:val="both"/>
-        <w:rPr>
-          <w:rFonts w:ascii="Times New Roman" w:hAnsi="Times New Roman" w:cs="Times New Roman"/>
-          <w:sz w:val="24"/>
-          <w:szCs w:val="24"/>
-        </w:rPr>
-      </w:pPr>
-      <w:r>
-        <w:rPr>
-          <w:rFonts w:ascii="Times New Roman" w:hAnsi="Times New Roman" w:cs="Times New Roman"/>
-          <w:sz w:val="24"/>
-          <w:szCs w:val="24"/>
-        </w:rPr>
-        <w:t>Обмий мене повнотою з беззаконня мого* і від гріха мого очисти мене.</w:t>
-      </w:r>
-    </w:p>
-    <w:p>
-      <w:pPr>
-        <w:spacing w:line="276" w:lineRule="auto"/>
-        <w:jc w:val="both"/>
-        <w:rPr>
-          <w:rFonts w:ascii="Times New Roman" w:hAnsi="Times New Roman" w:cs="Times New Roman"/>
-          <w:sz w:val="24"/>
-          <w:szCs w:val="24"/>
-        </w:rPr>
-      </w:pPr>
-      <w:r>
-        <w:rPr>
-          <w:rFonts w:ascii="Times New Roman" w:hAnsi="Times New Roman" w:cs="Times New Roman"/>
-          <w:sz w:val="24"/>
-          <w:szCs w:val="24"/>
-        </w:rPr>
-        <w:t>Бо беззаконня моє я знаю* і гріх мій є завжди передо мною.</w:t>
-      </w:r>
-    </w:p>
-    <w:p>
-      <w:pPr>
-        <w:spacing w:line="276" w:lineRule="auto"/>
-        <w:jc w:val="both"/>
-        <w:rPr>
-          <w:rFonts w:ascii="Times New Roman" w:hAnsi="Times New Roman" w:cs="Times New Roman"/>
-          <w:sz w:val="24"/>
-          <w:szCs w:val="24"/>
-        </w:rPr>
-      </w:pPr>
-      <w:r>
-        <w:rPr>
-          <w:rFonts w:ascii="Times New Roman" w:hAnsi="Times New Roman" w:cs="Times New Roman"/>
-          <w:sz w:val="24"/>
-          <w:szCs w:val="24"/>
-        </w:rPr>
         <w:t>Проти Тебе єдиного я згрішив* і перед Тобою зло вчинив.</w:t>
       </w:r>
     </w:p>
@@ -10580,102 +10430,102 @@
           <w:sz w:val="24"/>
           <w:szCs w:val="24"/>
         </w:rPr>
+        <w:t>Вороги мої ввесь час мене ображають;* ті, що лютують проти мене, кленýться мною.</w:t>
+      </w:r>
+    </w:p>
+    <w:p>
+      <w:pPr>
+        <w:spacing w:line="276" w:lineRule="auto"/>
+        <w:jc w:val="both"/>
+        <w:rPr>
+          <w:rFonts w:ascii="Times New Roman" w:hAnsi="Times New Roman" w:cs="Times New Roman"/>
+          <w:sz w:val="24"/>
+          <w:szCs w:val="24"/>
+        </w:rPr>
+      </w:pPr>
+      <w:r>
+        <w:rPr>
+          <w:rFonts w:ascii="Times New Roman" w:hAnsi="Times New Roman" w:cs="Times New Roman"/>
+          <w:sz w:val="24"/>
+          <w:szCs w:val="24"/>
+        </w:rPr>
+        <w:t>Бо я, неначе хліб, їм попіл,* і напиток мій із сльозами я змíшую:</w:t>
+      </w:r>
+    </w:p>
+    <w:p>
+      <w:pPr>
+        <w:spacing w:line="276" w:lineRule="auto"/>
+        <w:jc w:val="both"/>
+        <w:rPr>
+          <w:rFonts w:ascii="Times New Roman" w:hAnsi="Times New Roman" w:cs="Times New Roman"/>
+          <w:sz w:val="24"/>
+          <w:szCs w:val="24"/>
+        </w:rPr>
+      </w:pPr>
+      <w:r>
+        <w:rPr>
+          <w:rFonts w:ascii="Times New Roman" w:hAnsi="Times New Roman" w:cs="Times New Roman"/>
+          <w:sz w:val="24"/>
+          <w:szCs w:val="24"/>
+        </w:rPr>
+        <w:t>Через твій гнів і твоє обурення,* бо ти мене підняв і кинув.</w:t>
+      </w:r>
+    </w:p>
+    <w:p>
+      <w:pPr>
+        <w:spacing w:line="276" w:lineRule="auto"/>
+        <w:jc w:val="both"/>
+        <w:rPr>
+          <w:rFonts w:ascii="Times New Roman" w:hAnsi="Times New Roman" w:cs="Times New Roman"/>
+          <w:sz w:val="24"/>
+          <w:szCs w:val="24"/>
+        </w:rPr>
+      </w:pPr>
+      <w:r>
+        <w:rPr>
+          <w:rFonts w:ascii="Times New Roman" w:hAnsi="Times New Roman" w:cs="Times New Roman"/>
+          <w:sz w:val="24"/>
+          <w:szCs w:val="24"/>
+        </w:rPr>
+        <w:t>Дні мої, неначе тінь, що простягнулась,* і сам я, неначе трава, в’яну.</w:t>
+      </w:r>
+    </w:p>
+    <w:p>
+      <w:pPr>
+        <w:spacing w:line="276" w:lineRule="auto"/>
+        <w:jc w:val="both"/>
+        <w:rPr>
+          <w:rFonts w:ascii="Times New Roman" w:hAnsi="Times New Roman" w:cs="Times New Roman"/>
+          <w:sz w:val="24"/>
+          <w:szCs w:val="24"/>
+        </w:rPr>
+      </w:pPr>
+      <w:r>
+        <w:rPr>
+          <w:rFonts w:ascii="Times New Roman" w:hAnsi="Times New Roman" w:cs="Times New Roman"/>
+          <w:sz w:val="24"/>
+          <w:szCs w:val="24"/>
+        </w:rPr>
+        <w:t>Ти ж, Господи, сидиш повíки на престолі,* й ім’я твоє по всі роди.</w:t>
+      </w:r>
+    </w:p>
+    <w:p>
+      <w:pPr>
+        <w:spacing w:line="276" w:lineRule="auto"/>
+        <w:jc w:val="both"/>
+        <w:rPr>
+          <w:rFonts w:ascii="Times New Roman" w:hAnsi="Times New Roman" w:cs="Times New Roman"/>
+          <w:sz w:val="24"/>
+          <w:szCs w:val="24"/>
+        </w:rPr>
+      </w:pPr>
+      <w:r>
+        <w:rPr>
+          <w:rFonts w:ascii="Times New Roman" w:hAnsi="Times New Roman" w:cs="Times New Roman"/>
+          <w:sz w:val="24"/>
+          <w:szCs w:val="24"/>
+        </w:rPr>
         <w:lastRenderedPageBreak/>
-        <w:t>Вороги мої ввесь час мене ображають;* ті, що лютують проти мене, кленýться мною.</w:t>
-      </w:r>
-    </w:p>
-    <w:p>
-      <w:pPr>
-        <w:spacing w:line="276" w:lineRule="auto"/>
-        <w:jc w:val="both"/>
-        <w:rPr>
-          <w:rFonts w:ascii="Times New Roman" w:hAnsi="Times New Roman" w:cs="Times New Roman"/>
-          <w:sz w:val="24"/>
-          <w:szCs w:val="24"/>
-        </w:rPr>
-      </w:pPr>
-      <w:r>
-        <w:rPr>
-          <w:rFonts w:ascii="Times New Roman" w:hAnsi="Times New Roman" w:cs="Times New Roman"/>
-          <w:sz w:val="24"/>
-          <w:szCs w:val="24"/>
-        </w:rPr>
-        <w:t>Бо я, неначе хліб, їм попіл,* і напиток мій із сльозами я змíшую:</w:t>
-      </w:r>
-    </w:p>
-    <w:p>
-      <w:pPr>
-        <w:spacing w:line="276" w:lineRule="auto"/>
-        <w:jc w:val="both"/>
-        <w:rPr>
-          <w:rFonts w:ascii="Times New Roman" w:hAnsi="Times New Roman" w:cs="Times New Roman"/>
-          <w:sz w:val="24"/>
-          <w:szCs w:val="24"/>
-        </w:rPr>
-      </w:pPr>
-      <w:r>
-        <w:rPr>
-          <w:rFonts w:ascii="Times New Roman" w:hAnsi="Times New Roman" w:cs="Times New Roman"/>
-          <w:sz w:val="24"/>
-          <w:szCs w:val="24"/>
-        </w:rPr>
-        <w:t>Через твій гнів і твоє обурення,* бо ти мене підняв і кинув.</w:t>
-      </w:r>
-    </w:p>
-    <w:p>
-      <w:pPr>
-        <w:spacing w:line="276" w:lineRule="auto"/>
-        <w:jc w:val="both"/>
-        <w:rPr>
-          <w:rFonts w:ascii="Times New Roman" w:hAnsi="Times New Roman" w:cs="Times New Roman"/>
-          <w:sz w:val="24"/>
-          <w:szCs w:val="24"/>
-        </w:rPr>
-      </w:pPr>
-      <w:r>
-        <w:rPr>
-          <w:rFonts w:ascii="Times New Roman" w:hAnsi="Times New Roman" w:cs="Times New Roman"/>
-          <w:sz w:val="24"/>
-          <w:szCs w:val="24"/>
-        </w:rPr>
-        <w:t>Дні мої, неначе тінь, що простягнулась,* і сам я, неначе трава, в’яну.</w:t>
-      </w:r>
-    </w:p>
-    <w:p>
-      <w:pPr>
-        <w:spacing w:line="276" w:lineRule="auto"/>
-        <w:jc w:val="both"/>
-        <w:rPr>
-          <w:rFonts w:ascii="Times New Roman" w:hAnsi="Times New Roman" w:cs="Times New Roman"/>
-          <w:sz w:val="24"/>
-          <w:szCs w:val="24"/>
-        </w:rPr>
-      </w:pPr>
-      <w:r>
-        <w:rPr>
-          <w:rFonts w:ascii="Times New Roman" w:hAnsi="Times New Roman" w:cs="Times New Roman"/>
-          <w:sz w:val="24"/>
-          <w:szCs w:val="24"/>
-        </w:rPr>
-        <w:t>Ти ж, Господи, сидиш повíки на престолі,* й ім’я твоє по всі роди.</w:t>
-      </w:r>
-    </w:p>
-    <w:p>
-      <w:pPr>
-        <w:spacing w:line="276" w:lineRule="auto"/>
-        <w:jc w:val="both"/>
-        <w:rPr>
-          <w:rFonts w:ascii="Times New Roman" w:hAnsi="Times New Roman" w:cs="Times New Roman"/>
-          <w:sz w:val="24"/>
-          <w:szCs w:val="24"/>
-        </w:rPr>
-      </w:pPr>
-      <w:r>
-        <w:rPr>
-          <w:rFonts w:ascii="Times New Roman" w:hAnsi="Times New Roman" w:cs="Times New Roman"/>
-          <w:sz w:val="24"/>
-          <w:szCs w:val="24"/>
-        </w:rPr>
         <w:t>Ти встанеш, змилуєшся над Сіóном,* бо час над ним уже змилосердитись, бо прийшла година.</w:t>
       </w:r>
     </w:p>
@@ -11026,37 +10876,29 @@
           <w:sz w:val="24"/>
           <w:szCs w:val="24"/>
         </w:rPr>
-        <w:t xml:space="preserve">Господи Вседержителю, Боже отцíв наших, Авраáма й Ісаáка та Якова й праведного роду їх. Ти сотворив небо й землю з усією красою їх, ти зв’язáв море словом наказу твого. Ти замкнув безóдню і запечатав її страшним і славним Іменем твоїм, тебе все боїться і тремтить перед силою твоєю, бо ніхто не встоїть перед величністю слави твоєї; нестерпний гнів погрози твоєї на грíшників, але безмежна й недослідима милість обíтниці твоєї. Бо ти Господь Всевишній, милосердний, довготерпеливий і многомилостивий, і вболіваєш над гріхами людськими. Ти, Господи, з безмежної доброти твоєї, дав змогу покаяння і відпущення тим, що нагрішили перед тобою і, з безмежного милосердя твого, призначив покаяння для грíшних на спасіння. Ти ж, Господи, Боже сил,, не встановив покаяння для Авраáма, Ісаáка та Якова, що не згрішили перед тобою, але встановив покаяння для нас грíшних, бо гріхів наших бíльше, ніж піску морського. Намножилися беззаконня наші, Господи, намножилися беззаконня наші, тож ми недостойні глянути й побачити висоту небесну задля безлічі провин наших. Зв’язано нас великими оковами залізними так, що не можемо піднести голови й нема полéгші для нас, </w:t>
-      </w:r>
-      <w:r>
-        <w:rPr>
-          <w:rFonts w:ascii="Times New Roman" w:hAnsi="Times New Roman" w:cs="Times New Roman"/>
+        <w:t>Господи Вседержителю, Боже отцíв наших, Авраáма й Ісаáка та Якова й праведного роду їх. Ти сотворив небо й землю з усією красою їх, ти зв’язáв море словом наказу твого. Ти замкнув безóдню і запечатав її страшним і славним Іменем твоїм, тебе все боїться і тремтить перед силою твоєю, бо ніхто не встоїть перед величністю слави твоєї; нестерпний гнів погрози твоєї на грíшників, але безмежна й недослідима милість обíтниці твоєї. Бо ти Господь Всевишній, милосердний, довготерпеливий і многомилостивий, і вболіваєш над гріхами людськими. Ти, Господи, з безмежної доброти твоєї, дав змогу покаяння і відпущення тим, що нагрішили перед тобою і, з безмежного милосердя твого, призначив покаяння для грíшних на спасіння. Ти ж, Господи, Боже сил,, не встановив покаяння для Авраáма, Ісаáка та Якова, що не згрішили перед тобою, але встановив покаяння для нас грíшних, бо гріхів наших бíльше, ніж піску морського. Намножилися беззаконня наші, Господи, намножилися беззаконня наші, тож ми недостойні глянути й побачити висоту небесну задля безлічі провин наших. Зв’язано нас великими оковами залізними так, що не можемо піднести голови й нема полéгші для нас, бо ми прогнівили тебе, і лукаве перед тобою вчинили, не сповнивши волі твоєї і не додержавши наказів твоїх. Тому нині ми згинаємо коліна й від серця благаємо в тебе милосердя. Нагрішили ми, Господи, нагрішили, і беззаконня наші ми знаємо! Але прохаємо, благаючи: Прости нам, Господи, прости нам і не погуби нас з беззаконнями нашими, не пам’ятáй провин наших і в гнíві твоєму не засуди нас повíк до безодні. Бо ти, Боже, є Бог тих, що каються, і на нас виявив всю ласкавість свою: з великої милости твоєї спаси нас, недостóйних, і будемо тебе завжди прославляти за днів життя нашого. Бо тебе хвалять усí сили небесні й слава твоя на вíки вíчні.</w:t>
+      </w:r>
+    </w:p>
+    <w:p>
+      <w:pPr>
+        <w:spacing w:line="276" w:lineRule="auto"/>
+        <w:jc w:val="both"/>
+        <w:rPr>
+          <w:rFonts w:ascii="Times New Roman" w:hAnsi="Times New Roman" w:cs="Times New Roman"/>
+          <w:sz w:val="24"/>
+          <w:szCs w:val="24"/>
+        </w:rPr>
+      </w:pPr>
+      <w:r>
+        <w:rPr>
+          <w:rFonts w:ascii="Times New Roman" w:hAnsi="Times New Roman" w:cs="Times New Roman"/>
+          <w:i/>
+          <w:iCs/>
+          <w:color w:val="FF0000"/>
           <w:sz w:val="24"/>
           <w:szCs w:val="24"/>
         </w:rPr>
         <w:lastRenderedPageBreak/>
-        <w:t>бо ми прогнівили тебе, і лукаве перед тобою вчинили, не сповнивши волі твоєї і не додержавши наказів твоїх. Тому нині ми згинаємо коліна й від серця благаємо в тебе милосердя. Нагрішили ми, Господи, нагрішили, і беззаконня наші ми знаємо! Але прохаємо, благаючи: Прости нам, Господи, прости нам і не погуби нас з беззаконнями нашими, не пам’ятáй провин наших і в гнíві твоєму не засуди нас повíк до безодні. Бо ти, Боже, є Бог тих, що каються, і на нас виявив всю ласкавість свою: з великої милости твоєї спаси нас, недостóйних, і будемо тебе завжди прославляти за днів життя нашого. Бо тебе хвалять усí сили небесні й слава твоя на вíки вíчні.</w:t>
-      </w:r>
-    </w:p>
-    <w:p>
-      <w:pPr>
-        <w:spacing w:line="276" w:lineRule="auto"/>
-        <w:jc w:val="both"/>
-        <w:rPr>
-          <w:rFonts w:ascii="Times New Roman" w:hAnsi="Times New Roman" w:cs="Times New Roman"/>
-          <w:sz w:val="24"/>
-          <w:szCs w:val="24"/>
-        </w:rPr>
-      </w:pPr>
-      <w:r>
-        <w:rPr>
-          <w:rFonts w:ascii="Times New Roman" w:hAnsi="Times New Roman" w:cs="Times New Roman"/>
-          <w:i/>
-          <w:iCs/>
-          <w:color w:val="FF0000"/>
-          <w:sz w:val="24"/>
-          <w:szCs w:val="24"/>
-        </w:rPr>
         <w:t>Хор:</w:t>
       </w:r>
       <w:r>
@@ -11284,7 +11126,7 @@
           <w:szCs w:val="24"/>
         </w:rPr>
       </w:pPr>
-      <w:bookmarkStart w:id="5" w:name="_Hlk158712713"/>
+      <w:bookmarkStart w:id="4" w:name="_Hlk158712713"/>
       <w:r>
         <w:rPr>
           <w:rFonts w:ascii="Times New Roman" w:hAnsi="Times New Roman" w:cs="Times New Roman"/>
@@ -11411,7 +11253,7 @@
         <w:t>Милосердя двері відкрий нам,* благословенна Богородице,* щоб, надіючися на тебе, ми не погибнули,* але щоб ізбавились тобою від бід.* Ти бо єси спасення роду християнського.</w:t>
       </w:r>
     </w:p>
-    <w:bookmarkEnd w:id="5"/>
+    <w:bookmarkEnd w:id="4"/>
     <w:p>
       <w:pPr>
         <w:spacing w:line="276" w:lineRule="auto"/>
@@ -11591,7 +11433,6 @@
           <w:sz w:val="24"/>
           <w:szCs w:val="24"/>
         </w:rPr>
-        <w:lastRenderedPageBreak/>
         <w:t>Хор:</w:t>
       </w:r>
       <w:r>
@@ -12139,102 +11980,102 @@
           <w:sz w:val="24"/>
           <w:szCs w:val="24"/>
         </w:rPr>
+        <w:t>Господи, Боже, Агнче Божий, Сину Отця,* що береш гріхи світу, помилуй нас.</w:t>
+      </w:r>
+    </w:p>
+    <w:p>
+      <w:pPr>
+        <w:spacing w:line="276" w:lineRule="auto"/>
+        <w:jc w:val="both"/>
+        <w:rPr>
+          <w:rFonts w:ascii="Times New Roman" w:hAnsi="Times New Roman" w:cs="Times New Roman"/>
+          <w:sz w:val="24"/>
+          <w:szCs w:val="24"/>
+        </w:rPr>
+      </w:pPr>
+      <w:r>
+        <w:rPr>
+          <w:rFonts w:ascii="Times New Roman" w:hAnsi="Times New Roman" w:cs="Times New Roman"/>
+          <w:sz w:val="24"/>
+          <w:szCs w:val="24"/>
+        </w:rPr>
+        <w:t>Ти, що береш гріхи світу,* прийми нашу молитву.</w:t>
+      </w:r>
+    </w:p>
+    <w:p>
+      <w:pPr>
+        <w:spacing w:line="276" w:lineRule="auto"/>
+        <w:jc w:val="both"/>
+        <w:rPr>
+          <w:rFonts w:ascii="Times New Roman" w:hAnsi="Times New Roman" w:cs="Times New Roman"/>
+          <w:sz w:val="24"/>
+          <w:szCs w:val="24"/>
+        </w:rPr>
+      </w:pPr>
+      <w:r>
+        <w:rPr>
+          <w:rFonts w:ascii="Times New Roman" w:hAnsi="Times New Roman" w:cs="Times New Roman"/>
+          <w:sz w:val="24"/>
+          <w:szCs w:val="24"/>
+        </w:rPr>
+        <w:t>Ти, що сидиш по правиці Отця,* помилуй нас.</w:t>
+      </w:r>
+    </w:p>
+    <w:p>
+      <w:pPr>
+        <w:spacing w:line="276" w:lineRule="auto"/>
+        <w:jc w:val="both"/>
+        <w:rPr>
+          <w:rFonts w:ascii="Times New Roman" w:hAnsi="Times New Roman" w:cs="Times New Roman"/>
+          <w:sz w:val="24"/>
+          <w:szCs w:val="24"/>
+        </w:rPr>
+      </w:pPr>
+      <w:r>
+        <w:rPr>
+          <w:rFonts w:ascii="Times New Roman" w:hAnsi="Times New Roman" w:cs="Times New Roman"/>
+          <w:sz w:val="24"/>
+          <w:szCs w:val="24"/>
+        </w:rPr>
+        <w:t>Ти бо один лише святий, Ти єдиний Господь, Ісус Христос,* на славу Бога Отця. Амінь.</w:t>
+      </w:r>
+    </w:p>
+    <w:p>
+      <w:pPr>
+        <w:spacing w:line="276" w:lineRule="auto"/>
+        <w:jc w:val="both"/>
+        <w:rPr>
+          <w:rFonts w:ascii="Times New Roman" w:hAnsi="Times New Roman" w:cs="Times New Roman"/>
+          <w:sz w:val="24"/>
+          <w:szCs w:val="24"/>
+        </w:rPr>
+      </w:pPr>
+      <w:r>
+        <w:rPr>
+          <w:rFonts w:ascii="Times New Roman" w:hAnsi="Times New Roman" w:cs="Times New Roman"/>
+          <w:sz w:val="24"/>
+          <w:szCs w:val="24"/>
+        </w:rPr>
+        <w:t>Щоночі буду Тебе благословити* і хвалити ім’я Твоє на віки віків.</w:t>
+      </w:r>
+    </w:p>
+    <w:p>
+      <w:pPr>
+        <w:spacing w:line="276" w:lineRule="auto"/>
+        <w:jc w:val="both"/>
+        <w:rPr>
+          <w:rFonts w:ascii="Times New Roman" w:hAnsi="Times New Roman" w:cs="Times New Roman"/>
+          <w:sz w:val="24"/>
+          <w:szCs w:val="24"/>
+        </w:rPr>
+      </w:pPr>
+      <w:r>
+        <w:rPr>
+          <w:rFonts w:ascii="Times New Roman" w:hAnsi="Times New Roman" w:cs="Times New Roman"/>
+          <w:sz w:val="24"/>
+          <w:szCs w:val="24"/>
+        </w:rPr>
         <w:lastRenderedPageBreak/>
-        <w:t>Господи, Боже, Агнче Божий, Сину Отця,* що береш гріхи світу, помилуй нас.</w:t>
-      </w:r>
-    </w:p>
-    <w:p>
-      <w:pPr>
-        <w:spacing w:line="276" w:lineRule="auto"/>
-        <w:jc w:val="both"/>
-        <w:rPr>
-          <w:rFonts w:ascii="Times New Roman" w:hAnsi="Times New Roman" w:cs="Times New Roman"/>
-          <w:sz w:val="24"/>
-          <w:szCs w:val="24"/>
-        </w:rPr>
-      </w:pPr>
-      <w:r>
-        <w:rPr>
-          <w:rFonts w:ascii="Times New Roman" w:hAnsi="Times New Roman" w:cs="Times New Roman"/>
-          <w:sz w:val="24"/>
-          <w:szCs w:val="24"/>
-        </w:rPr>
-        <w:t>Ти, що береш гріхи світу,* прийми нашу молитву.</w:t>
-      </w:r>
-    </w:p>
-    <w:p>
-      <w:pPr>
-        <w:spacing w:line="276" w:lineRule="auto"/>
-        <w:jc w:val="both"/>
-        <w:rPr>
-          <w:rFonts w:ascii="Times New Roman" w:hAnsi="Times New Roman" w:cs="Times New Roman"/>
-          <w:sz w:val="24"/>
-          <w:szCs w:val="24"/>
-        </w:rPr>
-      </w:pPr>
-      <w:r>
-        <w:rPr>
-          <w:rFonts w:ascii="Times New Roman" w:hAnsi="Times New Roman" w:cs="Times New Roman"/>
-          <w:sz w:val="24"/>
-          <w:szCs w:val="24"/>
-        </w:rPr>
-        <w:t>Ти, що сидиш по правиці Отця,* помилуй нас.</w:t>
-      </w:r>
-    </w:p>
-    <w:p>
-      <w:pPr>
-        <w:spacing w:line="276" w:lineRule="auto"/>
-        <w:jc w:val="both"/>
-        <w:rPr>
-          <w:rFonts w:ascii="Times New Roman" w:hAnsi="Times New Roman" w:cs="Times New Roman"/>
-          <w:sz w:val="24"/>
-          <w:szCs w:val="24"/>
-        </w:rPr>
-      </w:pPr>
-      <w:r>
-        <w:rPr>
-          <w:rFonts w:ascii="Times New Roman" w:hAnsi="Times New Roman" w:cs="Times New Roman"/>
-          <w:sz w:val="24"/>
-          <w:szCs w:val="24"/>
-        </w:rPr>
-        <w:t>Ти бо один лише святий, Ти єдиний Господь, Ісус Христос,* на славу Бога Отця. Амінь.</w:t>
-      </w:r>
-    </w:p>
-    <w:p>
-      <w:pPr>
-        <w:spacing w:line="276" w:lineRule="auto"/>
-        <w:jc w:val="both"/>
-        <w:rPr>
-          <w:rFonts w:ascii="Times New Roman" w:hAnsi="Times New Roman" w:cs="Times New Roman"/>
-          <w:sz w:val="24"/>
-          <w:szCs w:val="24"/>
-        </w:rPr>
-      </w:pPr>
-      <w:r>
-        <w:rPr>
-          <w:rFonts w:ascii="Times New Roman" w:hAnsi="Times New Roman" w:cs="Times New Roman"/>
-          <w:sz w:val="24"/>
-          <w:szCs w:val="24"/>
-        </w:rPr>
-        <w:t>Щоночі буду Тебе благословити* і хвалити ім’я Твоє на віки віків.</w:t>
-      </w:r>
-    </w:p>
-    <w:p>
-      <w:pPr>
-        <w:spacing w:line="276" w:lineRule="auto"/>
-        <w:jc w:val="both"/>
-        <w:rPr>
-          <w:rFonts w:ascii="Times New Roman" w:hAnsi="Times New Roman" w:cs="Times New Roman"/>
-          <w:sz w:val="24"/>
-          <w:szCs w:val="24"/>
-        </w:rPr>
-      </w:pPr>
-      <w:r>
-        <w:rPr>
-          <w:rFonts w:ascii="Times New Roman" w:hAnsi="Times New Roman" w:cs="Times New Roman"/>
-          <w:sz w:val="24"/>
-          <w:szCs w:val="24"/>
-        </w:rPr>
         <w:t>Господи, Ти був нам пристановищем* по всі роди.</w:t>
       </w:r>
     </w:p>
@@ -12681,7 +12522,6 @@
         <w:pStyle w:val="Heading3"/>
       </w:pPr>
       <w:r>
-        <w:lastRenderedPageBreak/>
         <w:t>Господи сил</w:t>
       </w:r>
     </w:p>
@@ -12779,6 +12619,7 @@
           <w:sz w:val="24"/>
           <w:szCs w:val="24"/>
         </w:rPr>
+        <w:lastRenderedPageBreak/>
         <w:t>Після кожного стиха співається тропар</w:t>
       </w:r>
       <w:r>
@@ -13442,6 +13283,7 @@
           <w:sz w:val="24"/>
           <w:szCs w:val="24"/>
         </w:rPr>
+        <w:lastRenderedPageBreak/>
         <w:t xml:space="preserve">Так, Господи, Царю! Дай мені бачити гріхи мої i не осуджувати брата мого, бо ти благословенний на віки віків. Амінь. </w:t>
       </w:r>
       <w:r>
@@ -13481,59 +13323,38 @@
     </w:p>
     <w:p>
       <w:pPr>
-        <w:spacing w:line="276" w:lineRule="auto"/>
-        <w:jc w:val="both"/>
-        <w:rPr>
-          <w:rFonts w:ascii="Times New Roman" w:hAnsi="Times New Roman" w:cs="Times New Roman"/>
-          <w:sz w:val="24"/>
-          <w:szCs w:val="24"/>
-        </w:rPr>
-      </w:pPr>
-      <w:r>
-        <w:rPr>
-          <w:rFonts w:ascii="Times New Roman" w:hAnsi="Times New Roman" w:cs="Times New Roman"/>
-          <w:sz w:val="24"/>
-          <w:szCs w:val="24"/>
-        </w:rPr>
-        <w:t>Боже, милостивий будь мені, грішному!</w:t>
-      </w:r>
-    </w:p>
-    <w:p>
-      <w:pPr>
-        <w:spacing w:line="276" w:lineRule="auto"/>
-        <w:jc w:val="both"/>
-        <w:rPr>
-          <w:rFonts w:ascii="Times New Roman" w:hAnsi="Times New Roman" w:cs="Times New Roman"/>
-          <w:sz w:val="24"/>
-          <w:szCs w:val="24"/>
-        </w:rPr>
-      </w:pPr>
-      <w:r>
-        <w:rPr>
-          <w:rFonts w:ascii="Times New Roman" w:hAnsi="Times New Roman" w:cs="Times New Roman"/>
-          <w:sz w:val="24"/>
-          <w:szCs w:val="24"/>
-        </w:rPr>
-        <w:t>Боже, очисти гріхи мої i помилуй мене!</w:t>
-      </w:r>
-    </w:p>
-    <w:p>
-      <w:pPr>
-        <w:spacing w:line="276" w:lineRule="auto"/>
-        <w:jc w:val="both"/>
-        <w:rPr>
-          <w:rFonts w:ascii="Times New Roman" w:hAnsi="Times New Roman" w:cs="Times New Roman"/>
-          <w:sz w:val="24"/>
-          <w:szCs w:val="24"/>
-        </w:rPr>
-      </w:pPr>
-      <w:r>
-        <w:rPr>
-          <w:rFonts w:ascii="Times New Roman" w:hAnsi="Times New Roman" w:cs="Times New Roman"/>
-          <w:sz w:val="24"/>
-          <w:szCs w:val="24"/>
-        </w:rPr>
-        <w:t>Без числа нагрішив я, Господи, прости мені!</w:t>
+        <w:spacing w:after="120"/>
+      </w:pPr>
+      <w:r>
+        <w:rPr>
+          <w:rFonts w:ascii="Times New Roman" w:hAnsi="Times New Roman"/>
+          <w:sz w:val="24"/>
+        </w:rPr>
+        <w:t>Бо́же, будь милости́вим до ме́не, грі́шного!</w:t>
+      </w:r>
+    </w:p>
+    <w:p>
+      <w:pPr>
+        <w:spacing w:after="120"/>
+      </w:pPr>
+      <w:r>
+        <w:rPr>
+          <w:rFonts w:ascii="Times New Roman" w:hAnsi="Times New Roman"/>
+          <w:sz w:val="24"/>
+        </w:rPr>
+        <w:t>Бо́же, очи́сти мої́ гріхи́ і поми́луй мене́!</w:t>
+      </w:r>
+    </w:p>
+    <w:p>
+      <w:pPr>
+        <w:spacing w:after="120"/>
+      </w:pPr>
+      <w:r>
+        <w:rPr>
+          <w:rFonts w:ascii="Times New Roman" w:hAnsi="Times New Roman"/>
+          <w:sz w:val="24"/>
+        </w:rPr>
+        <w:t>Без числа́ нагріши́в я, Го́споди, прости́ мені́!</w:t>
       </w:r>
     </w:p>
     <w:p>
@@ -13880,7 +13701,16 @@
           <w:sz w:val="24"/>
           <w:szCs w:val="24"/>
         </w:rPr>
-        <w:t xml:space="preserve"> Нескверна, непорочна, нетлінна, пречиста Діво, богоневісто Владичице! Ти преславним своїм народженням Бога Слово з людьми з’єднала й впалу нашу природу з небесною злучила. Безнадійних – єдина надіє й допомого переможених; готове заступництво тим, що до тебе прибігають i всіх християн захисте. Не гидуй нами, грішними і скверними, що злими думками, словами й ділами вчинили себе цілком негідними й стали рабами похотей, недбальства й лінивства. Але, як Мати людинолюбного Бога, змилуйся чоловiколюбно над нами, грішними й блудними, i прийми наше моління, що його приносимо тобі скверними устами. Обнявши твого Сина й нашого Владику i Господа з матерньою сміливістю, умоли його, щоб відкрив нам людинолюбне милосердя своєї доброти i, незважаючи на наші незліченні провини, навернув нас на покаяння й учинив нас вмілими виконавцями своїх заповідей. Будь при нас, як милостива, й милосердна, i чоловіколюбна, завжди i в теперішньому житті, теплою заступницею й помічницею, відганяючи полки супротивників, наставляючи нас на спасіння; а в час відходу зберігай нашу окаянну душу; відганяй далеко від неї темні примари лукавих духів. У страшний день праведного суду визволь нас від вічної муки, вчиняючи спадкоємцями несказанної слави твого Сина й Бога нашого; щоб ми осягнули її, Владичице наша, пресвята Богородице, за твоїм заступництвом i поміччю, благодаттю і чоловіколюб’ям єдинородного твого Сина, Господа Бога й Спаса нашого Ісуса Христа, якому належить усяка слава, честь i поклоніння з безначальним його Отцем та з пресвятим, i благим, і животворним його Духом, нині i повсякчас, i на віки віків.</w:t>
+        <w:t xml:space="preserve"> Нескверна, непорочна, нетлінна, пречиста Діво, богоневісто Владичице! Ти преславним своїм народженням Бога Слово з людьми з’єднала й впалу нашу природу з небесною злучила. Безнадійних – єдина надіє й допомого переможених; готове заступництво тим, що до тебе прибігають i всіх християн захисте. Не гидуй нами, грішними і скверними, що злими думками, словами й ділами вчинили себе цілком негідними й стали рабами похотей, недбальства й лінивства. Але, як Мати людинолюбного Бога, змилуйся чоловiколюбно над нами, грішними й блудними, i прийми наше моління, що його приносимо тобі скверними устами. Обнявши твого Сина й нашого Владику i Господа з матерньою сміливістю, умоли його, щоб відкрив нам людинолюбне милосердя своєї доброти i, незважаючи на наші незліченні провини, навернув нас на покаяння й учинив нас вмілими виконавцями своїх заповідей. Будь при нас, як милостива, й милосердна, i чоловіколюбна, завжди i в </w:t>
+      </w:r>
+      <w:r>
+        <w:rPr>
+          <w:rFonts w:ascii="Times New Roman" w:hAnsi="Times New Roman" w:cs="Times New Roman"/>
+          <w:sz w:val="24"/>
+          <w:szCs w:val="24"/>
+        </w:rPr>
+        <w:lastRenderedPageBreak/>
+        <w:t>теперішньому житті, теплою заступницею й помічницею, відганяючи полки супротивників, наставляючи нас на спасіння; а в час відходу зберігай нашу окаянну душу; відганяй далеко від неї темні примари лукавих духів. У страшний день праведного суду визволь нас від вічної муки, вчиняючи спадкоємцями несказанної слави твого Сина й Бога нашого; щоб ми осягнули її, Владичице наша, пресвята Богородице, за твоїм заступництвом i поміччю, благодаттю і чоловіколюб’ям єдинородного твого Сина, Господа Бога й Спаса нашого Ісуса Христа, якому належить усяка слава, честь i поклоніння з безначальним його Отцем та з пресвятим, i благим, і животворним його Духом, нині i повсякчас, i на віки віків.</w:t>
       </w:r>
     </w:p>
     <w:p>
@@ -14342,43 +14172,43 @@
         <w:spacing w:line="276" w:lineRule="auto"/>
         <w:jc w:val="both"/>
         <w:rPr>
-          <w:rFonts w:ascii="Times New Roman" w:hAnsi="Times New Roman" w:cs="Times New Roman"/>
-          <w:sz w:val="24"/>
-          <w:szCs w:val="24"/>
-        </w:rPr>
-      </w:pPr>
-      <w:r>
-        <w:rPr>
-          <w:rFonts w:ascii="Times New Roman" w:hAnsi="Times New Roman" w:cs="Times New Roman"/>
-          <w:sz w:val="24"/>
-          <w:szCs w:val="24"/>
-        </w:rPr>
-        <w:t>Владико многомилостивий, Господи Ісусе Христе, Боже наш! Молитвами пречистої Владичиці нашої Богородиці і Приснодіви Марії, силою чесного і животворящого Хреста, заступництвом чесних небесних сил безплотних,; чесного і славного пророка, предтечі і хрестителя Йоана, святих славних і всехвальних апостолів, святих отців наших і вселенських великих учителів і святителів Василія Великого, Григорія Богослова, Івана Золотоустого, Атанасія і Кирила, святого отця нашого Миколая, архиєпископа Мирлікійського, чудотворця, святих рівноапостольних Кирила і Методія, учителів слов’янських, святого благовірного і рівноапостольного великого князя Володимира, святого священномученика Йосафата, святих, славних і переможних мучеників, преподобних і богоносних отців наших Антонія і Теодосія Печерських та інших преподобних і богоносних отців наших, святих і праведних богоотців Йоакима і Анни, і святого</w:t>
-      </w:r>
-      <w:r>
-        <w:rPr>
-          <w:rFonts w:ascii="Times New Roman" w:hAnsi="Times New Roman" w:cs="Times New Roman"/>
-          <w:i/>
-          <w:iCs/>
-          <w:sz w:val="24"/>
-          <w:szCs w:val="24"/>
-        </w:rPr>
-        <w:t xml:space="preserve"> </w:t>
-      </w:r>
-      <w:r>
-        <w:rPr>
-          <w:rFonts w:ascii="Times New Roman" w:hAnsi="Times New Roman" w:cs="Times New Roman"/>
-          <w:i/>
-          <w:iCs/>
-          <w:color w:val="FF0000"/>
-          <w:sz w:val="24"/>
-          <w:szCs w:val="24"/>
-        </w:rPr>
-        <w:t>(ім'я, якого є храм і день)</w:t>
-      </w:r>
-      <w:r>
-        <w:rPr>
-          <w:rFonts w:ascii="Times New Roman" w:hAnsi="Times New Roman" w:cs="Times New Roman"/>
+          <w:rFonts w:ascii="Times New Roman" w:eastAsia="Times New Roman" w:hAnsi="Times New Roman" w:cs="Times New Roman"/>
+          <w:sz w:val="24"/>
+          <w:szCs w:val="24"/>
+        </w:rPr>
+      </w:pPr>
+      <w:r>
+        <w:rPr>
+          <w:rFonts w:ascii="Times New Roman" w:eastAsia="Times New Roman" w:hAnsi="Times New Roman" w:cs="Times New Roman"/>
+          <w:sz w:val="24"/>
+          <w:szCs w:val="24"/>
+        </w:rPr>
+        <w:t>Владико многомилостивий, Господи Ісусе Христе, Боже наш! Молитвами пречистої Владичиці нашої Богородиці і Приснодіви Марії, силою чесного і животворчого Хреста, заступництвом чесних небесних сил безтілесних, чесного і славного пророка, предтечі і хрестителя Йоана, святих славних і всехвальних апостолів, святих отців наших і вселенських великих учителів і святителів Василія Великого, Григорія Богослова, Івана Золотоустого, Атанасія і Кирила, святого отця нашого Миколая, архиєпископа Мирлікійського, чудотворця, святих рівноапостольних Кирила і Методія, учителів слов’янських, святого благовірного і рівноапостольного великого князя Володимира, святого священномученика Йосафата, святих, славних і переможних мучеників, преподобних і богоносних отців наших Антонія і Теодосія Печерських та інших преподобних і богоносних отців наших, святих і праведних богоотців Йоакима і Анни, і святого</w:t>
+      </w:r>
+      <w:r>
+        <w:rPr>
+          <w:rFonts w:ascii="Times New Roman" w:eastAsia="Times New Roman" w:hAnsi="Times New Roman" w:cs="Times New Roman"/>
+          <w:i/>
+          <w:iCs/>
+          <w:sz w:val="24"/>
+          <w:szCs w:val="24"/>
+        </w:rPr>
+        <w:t> </w:t>
+      </w:r>
+      <w:r>
+        <w:rPr>
+          <w:rFonts w:ascii="Times New Roman" w:eastAsia="Times New Roman" w:hAnsi="Times New Roman" w:cs="Times New Roman"/>
+          <w:i/>
+          <w:iCs/>
+          <w:color w:val="FF0000"/>
+          <w:sz w:val="24"/>
+          <w:szCs w:val="24"/>
+        </w:rPr>
+        <w:t>(ім'я, якого є храм)</w:t>
+      </w:r>
+      <w:r>
+        <w:rPr>
+          <w:rFonts w:ascii="Times New Roman" w:eastAsia="Times New Roman" w:hAnsi="Times New Roman" w:cs="Times New Roman"/>
           <w:i/>
           <w:iCs/>
           <w:sz w:val="24"/>
@@ -14388,11 +14218,20 @@
       </w:r>
       <w:r>
         <w:rPr>
-          <w:rFonts w:ascii="Times New Roman" w:hAnsi="Times New Roman" w:cs="Times New Roman"/>
-          <w:sz w:val="24"/>
-          <w:szCs w:val="24"/>
-        </w:rPr>
-        <w:t xml:space="preserve"> і всіх святих, - приємну вчини молитву нашу, даруй нам прощення гріхів наших, покрий нас ласкою своєю, віджени від нас усякого ворога й супротивника. Втихомир наше життя, Господи, помилуй нас і світ твій і спаси душі наші, як благий і Людинолюбець.</w:t>
+          <w:rFonts w:ascii="Times New Roman" w:eastAsia="Times New Roman" w:hAnsi="Times New Roman" w:cs="Times New Roman"/>
+          <w:sz w:val="24"/>
+          <w:szCs w:val="24"/>
+        </w:rPr>
+        <w:t xml:space="preserve"> і святого отця нашого Тарасія, архиєпископа </w:t>
+      </w:r>
+      <w:r>
+        <w:rPr>
+          <w:rFonts w:ascii="Times New Roman" w:eastAsia="Times New Roman" w:hAnsi="Times New Roman" w:cs="Times New Roman"/>
+          <w:sz w:val="24"/>
+          <w:szCs w:val="24"/>
+        </w:rPr>
+        <w:lastRenderedPageBreak/>
+        <w:t>Царгородського, і всіх святих, - приємну вчини молитву нашу, даруй нам прощення гріхів наших, покрий нас ласкою своєю, віджени від нас усякого ворога й супротивника. Втихомир наше життя, Господи, помилуй нас і світ твій і спаси душі наші, як благий і людинолюбний.</w:t>
       </w:r>
     </w:p>
     <w:p>
@@ -15073,6 +14912,23 @@
       <w:szCs w:val="26"/>
     </w:rPr>
   </w:style>
+  <w:style w:type="paragraph" w:styleId="NormalWeb">
+    <w:name w:val="Normal (Web)"/>
+    <w:basedOn w:val="Normal"/>
+    <w:uiPriority w:val="99"/>
+    <w:semiHidden/>
+    <w:unhideWhenUsed/>
+    <w:rsid w:val="00DD5E49"/>
+    <w:pPr>
+      <w:spacing w:before="100" w:beforeAutospacing="1" w:after="100" w:afterAutospacing="1" w:line="240" w:lineRule="auto"/>
+    </w:pPr>
+    <w:rPr>
+      <w:rFonts w:ascii="Times New Roman" w:eastAsia="Times New Roman" w:hAnsi="Times New Roman" w:cs="Times New Roman"/>
+      <w:sz w:val="24"/>
+      <w:szCs w:val="24"/>
+      <w:lang w:eastAsia="uk-UA"/>
+    </w:rPr>
+  </w:style>
 </w:styles>
 </file>
 

</xml_diff>